<commit_message>
Cerrar el punto 1.2 Identificación del módulo
Añade el texto y los cuadros del 1.2 a la plantilla de la segunda
entrega: créditos/horas, horas fase centro/empresa, y la introducción
sobre la importancia de la FP y el RD 659/2023. Corrige una cita
errónea de la plantilla de la preparadora (artículo 96 → 97 del RD
659/2023), verificada contra el texto consolidado del BOE.

Co-Authored-By: Claude Sonnet 5 <noreply@anthropic.com>
Claude-Session: https://claude.ai/code/session_018x8SAWzLDt9GJuoqda3PdZ
</commit_message>
<xml_diff>
--- a/preparacion-oposicion-2027/materiales/Plantilla_Entrega2_0017_Habilidades_Sociales.docx
+++ b/preparacion-oposicion-2027/materiales/Plantilla_Entrega2_0017_Habilidades_Sociales.docx
@@ -631,20 +631,490 @@
     </w:p>
     <w:p>
       <w:pPr>
-        <w:spacing w:after="240" w:line="240"/>
-      </w:pPr>
-      <w:r>
-        <w:rPr>
-          <w:rFonts w:ascii="Arial" w:cs="Arial" w:eastAsia="Arial" w:hAnsi="Arial"/>
-          <w:i/>
-          <w:iCs/>
-          <w:color w:val="808080"/>
+        <w:spacing w:after="160" w:line="240"/>
+      </w:pPr>
+      <w:r>
+        <w:rPr>
+          <w:rFonts w:ascii="Arial" w:cs="Arial" w:eastAsia="Arial" w:hAnsi="Arial"/>
+          <w:b w:val="false"/>
+          <w:bCs w:val="false"/>
+          <w:i w:val="false"/>
+          <w:iCs w:val="false"/>
           <w:sz w:val="22"/>
           <w:szCs w:val="22"/>
         </w:rPr>
-        <w:t xml:space="preserve">[Pendiente de redactar]</w:t>
-      </w:r>
-    </w:p>
+        <w:t xml:space="preserve">La Formación Profesional constituye en la actualidad una vía esencial de cualificación y de acceso al empleo, orientada a dotar al alumnado de las competencias profesionales, personales y sociales necesarias para su incorporación al mundo laboral y su desarrollo a lo largo de la vida. En este sentido, la Ley Orgánica 3/2022, de 31 de marzo, de ordenación e integración de la Formación Profesional, junto con el Real Decreto 659/2023, de 18 de julio, por el que se desarrolla la ordenación del Sistema de Formación Profesional, consolidan el carácter dual de toda la Formación Profesional, atribuyéndolo a los grados D del Sistema de Formación Profesional español —entre los que se incluyen los ciclos formativos de grado medio y de grado superior—, y refuerzan la corresponsabilidad y la colaboración entre los centros educativos y las empresas u organismos equiparados.</w:t>
+      </w:r>
+    </w:p>
+    <w:p>
+      <w:pPr>
+        <w:spacing w:after="160" w:line="240"/>
+      </w:pPr>
+      <w:r>
+        <w:rPr>
+          <w:rFonts w:ascii="Arial" w:cs="Arial" w:eastAsia="Arial" w:hAnsi="Arial"/>
+          <w:b w:val="false"/>
+          <w:bCs w:val="false"/>
+          <w:i w:val="false"/>
+          <w:iCs w:val="false"/>
+          <w:sz w:val="22"/>
+          <w:szCs w:val="22"/>
+        </w:rPr>
+        <w:t xml:space="preserve">Conforme al artículo 97 del Real Decreto 659/2023, de 18 de julio, el currículo de los ciclos formativos de grado medio y de grado superior se organiza, en el ámbito de la Comunidad Autónoma de la Región de Murcia, incorporando módulos profesionales asociados a los estándares de competencia profesional del Catálogo Modular de Formación Profesional.</w:t>
+      </w:r>
+    </w:p>
+    <w:p>
+      <w:pPr>
+        <w:spacing w:after="160" w:line="240"/>
+      </w:pPr>
+      <w:r>
+        <w:rPr>
+          <w:rFonts w:ascii="Arial" w:cs="Arial" w:eastAsia="Arial" w:hAnsi="Arial"/>
+          <w:b w:val="false"/>
+          <w:bCs w:val="false"/>
+          <w:i w:val="false"/>
+          <w:iCs w:val="false"/>
+          <w:sz w:val="22"/>
+          <w:szCs w:val="22"/>
+        </w:rPr>
+        <w:t xml:space="preserve">Esta programación didáctica se desarrolla a partir del módulo profesional 0017. Habilidades sociales, perteneciente al título de Técnico Superior en Integración Social —ciclo formativo de grado superior de la familia profesional de Servicios Socioculturales y a la Comunidad, con una duración total de 2.000 horas, referente CINE-5b y Nivel 1 del Marco Español de Cualificaciones para la Educación Superior (MECES)—, el cual queda identificado por los siguientes elementos:</w:t>
+      </w:r>
+    </w:p>
+    <w:tbl>
+      <w:tblPr>
+        <w:tblW w:type="dxa" w:w="9598"/>
+        <w:tblBorders>
+          <w:top w:val="single" w:color="auto" w:sz="4"/>
+          <w:left w:val="single" w:color="auto" w:sz="4"/>
+          <w:bottom w:val="single" w:color="auto" w:sz="4"/>
+          <w:right w:val="single" w:color="auto" w:sz="4"/>
+          <w:insideH w:val="single" w:color="auto" w:sz="4"/>
+          <w:insideV w:val="single" w:color="auto" w:sz="4"/>
+        </w:tblBorders>
+      </w:tblPr>
+      <w:tblGrid>
+        <w:gridCol w:w="4200"/>
+        <w:gridCol w:w="5398"/>
+      </w:tblGrid>
+      <w:tr>
+        <w:tc>
+          <w:tcPr>
+            <w:tcW w:type="dxa" w:w="4200"/>
+            <w:shd w:fill="DCE6F1" w:color="auto" w:val="clear"/>
+            <w:tcMar>
+              <w:top w:type="dxa" w:w="80"/>
+              <w:left w:type="dxa" w:w="100"/>
+              <w:bottom w:type="dxa" w:w="80"/>
+              <w:right w:type="dxa" w:w="100"/>
+            </w:tcMar>
+            <w:vAlign w:val="center"/>
+          </w:tcPr>
+          <w:p>
+            <w:pPr>
+              <w:spacing w:line="240"/>
+            </w:pPr>
+            <w:r>
+              <w:rPr>
+                <w:rFonts w:ascii="Arial" w:cs="Arial" w:eastAsia="Arial" w:hAnsi="Arial"/>
+                <w:b/>
+                <w:bCs/>
+                <w:sz w:val="20"/>
+                <w:szCs w:val="20"/>
+              </w:rPr>
+              <w:t xml:space="preserve">CÓDIGO/MÓDULO</w:t>
+            </w:r>
+          </w:p>
+        </w:tc>
+        <w:tc>
+          <w:tcPr>
+            <w:tcW w:type="dxa" w:w="5398"/>
+            <w:tcMar>
+              <w:top w:type="dxa" w:w="80"/>
+              <w:left w:type="dxa" w:w="100"/>
+              <w:bottom w:type="dxa" w:w="80"/>
+              <w:right w:type="dxa" w:w="100"/>
+            </w:tcMar>
+            <w:vAlign w:val="center"/>
+          </w:tcPr>
+          <w:p>
+            <w:pPr>
+              <w:spacing w:line="240"/>
+            </w:pPr>
+            <w:r>
+              <w:rPr>
+                <w:rFonts w:ascii="Arial" w:cs="Arial" w:eastAsia="Arial" w:hAnsi="Arial"/>
+                <w:sz w:val="20"/>
+                <w:szCs w:val="20"/>
+              </w:rPr>
+              <w:t xml:space="preserve">0017.</w:t>
+            </w:r>
+          </w:p>
+        </w:tc>
+      </w:tr>
+      <w:tr>
+        <w:tc>
+          <w:tcPr>
+            <w:tcW w:type="dxa" w:w="4200"/>
+            <w:shd w:fill="DCE6F1" w:color="auto" w:val="clear"/>
+            <w:tcMar>
+              <w:top w:type="dxa" w:w="80"/>
+              <w:left w:type="dxa" w:w="100"/>
+              <w:bottom w:type="dxa" w:w="80"/>
+              <w:right w:type="dxa" w:w="100"/>
+            </w:tcMar>
+            <w:vAlign w:val="center"/>
+          </w:tcPr>
+          <w:p>
+            <w:pPr>
+              <w:spacing w:line="240"/>
+            </w:pPr>
+            <w:r>
+              <w:rPr>
+                <w:rFonts w:ascii="Arial" w:cs="Arial" w:eastAsia="Arial" w:hAnsi="Arial"/>
+                <w:b/>
+                <w:bCs/>
+                <w:sz w:val="20"/>
+                <w:szCs w:val="20"/>
+              </w:rPr>
+              <w:t xml:space="preserve">DENOMINACIÓN</w:t>
+            </w:r>
+          </w:p>
+        </w:tc>
+        <w:tc>
+          <w:tcPr>
+            <w:tcW w:type="dxa" w:w="5398"/>
+            <w:tcMar>
+              <w:top w:type="dxa" w:w="80"/>
+              <w:left w:type="dxa" w:w="100"/>
+              <w:bottom w:type="dxa" w:w="80"/>
+              <w:right w:type="dxa" w:w="100"/>
+            </w:tcMar>
+            <w:vAlign w:val="center"/>
+          </w:tcPr>
+          <w:p>
+            <w:pPr>
+              <w:spacing w:line="240"/>
+            </w:pPr>
+            <w:r>
+              <w:rPr>
+                <w:rFonts w:ascii="Arial" w:cs="Arial" w:eastAsia="Arial" w:hAnsi="Arial"/>
+                <w:sz w:val="20"/>
+                <w:szCs w:val="20"/>
+              </w:rPr>
+              <w:t xml:space="preserve">Habilidades sociales. Módulo que desarrolla las competencias de comunicación, inteligencia emocional, dinamización de grupos, conducción de reuniones, gestión de conflictos y evaluación de la competencia social necesarias para la intervención profesional con personas y grupos en riesgo de exclusión social.</w:t>
+            </w:r>
+          </w:p>
+        </w:tc>
+      </w:tr>
+      <w:tr>
+        <w:tc>
+          <w:tcPr>
+            <w:tcW w:type="dxa" w:w="4200"/>
+            <w:shd w:fill="DCE6F1" w:color="auto" w:val="clear"/>
+            <w:tcMar>
+              <w:top w:type="dxa" w:w="80"/>
+              <w:left w:type="dxa" w:w="100"/>
+              <w:bottom w:type="dxa" w:w="80"/>
+              <w:right w:type="dxa" w:w="100"/>
+            </w:tcMar>
+            <w:vAlign w:val="center"/>
+          </w:tcPr>
+          <w:p>
+            <w:pPr>
+              <w:spacing w:line="240"/>
+            </w:pPr>
+            <w:r>
+              <w:rPr>
+                <w:rFonts w:ascii="Arial" w:cs="Arial" w:eastAsia="Arial" w:hAnsi="Arial"/>
+                <w:b/>
+                <w:bCs/>
+                <w:sz w:val="20"/>
+                <w:szCs w:val="20"/>
+              </w:rPr>
+              <w:t xml:space="preserve">CRÉDITOS ECTS / HORAS</w:t>
+            </w:r>
+          </w:p>
+        </w:tc>
+        <w:tc>
+          <w:tcPr>
+            <w:tcW w:type="dxa" w:w="5398"/>
+            <w:tcMar>
+              <w:top w:type="dxa" w:w="80"/>
+              <w:left w:type="dxa" w:w="100"/>
+              <w:bottom w:type="dxa" w:w="80"/>
+              <w:right w:type="dxa" w:w="100"/>
+            </w:tcMar>
+            <w:vAlign w:val="center"/>
+          </w:tcPr>
+          <w:p>
+            <w:pPr>
+              <w:spacing w:line="240"/>
+            </w:pPr>
+            <w:r>
+              <w:rPr>
+                <w:rFonts w:ascii="Arial" w:cs="Arial" w:eastAsia="Arial" w:hAnsi="Arial"/>
+                <w:sz w:val="20"/>
+                <w:szCs w:val="20"/>
+              </w:rPr>
+              <w:t xml:space="preserve">6 créditos ECTS / 155 horas.</w:t>
+            </w:r>
+          </w:p>
+        </w:tc>
+      </w:tr>
+    </w:tbl>
+    <w:tbl>
+      <w:tblPr>
+        <w:tblW w:type="dxa" w:w="9598"/>
+        <w:tblBorders>
+          <w:top w:val="single" w:color="auto" w:sz="4"/>
+          <w:left w:val="single" w:color="auto" w:sz="4"/>
+          <w:bottom w:val="single" w:color="auto" w:sz="4"/>
+          <w:right w:val="single" w:color="auto" w:sz="4"/>
+          <w:insideH w:val="single" w:color="auto" w:sz="4"/>
+          <w:insideV w:val="single" w:color="auto" w:sz="4"/>
+        </w:tblBorders>
+      </w:tblPr>
+      <w:tblGrid>
+        <w:gridCol w:w="3200"/>
+        <w:gridCol w:w="3199"/>
+        <w:gridCol w:w="3199"/>
+      </w:tblGrid>
+      <w:tr>
+        <w:tc>
+          <w:tcPr>
+            <w:tcW w:type="dxa" w:w="4200"/>
+            <w:shd w:fill="DCE6F1" w:color="auto" w:val="clear"/>
+            <w:tcMar>
+              <w:top w:type="dxa" w:w="80"/>
+              <w:left w:type="dxa" w:w="100"/>
+              <w:bottom w:type="dxa" w:w="80"/>
+              <w:right w:type="dxa" w:w="100"/>
+            </w:tcMar>
+            <w:vAlign w:val="center"/>
+          </w:tcPr>
+          <w:p>
+            <w:pPr>
+              <w:spacing w:line="240"/>
+            </w:pPr>
+            <w:r>
+              <w:rPr>
+                <w:rFonts w:ascii="Arial" w:cs="Arial" w:eastAsia="Arial" w:hAnsi="Arial"/>
+                <w:b/>
+                <w:bCs/>
+                <w:sz w:val="20"/>
+                <w:szCs w:val="20"/>
+              </w:rPr>
+              <w:t xml:space="preserve">HORAS TOTALES DEL MÓDULO</w:t>
+            </w:r>
+          </w:p>
+        </w:tc>
+        <w:tc>
+          <w:tcPr>
+            <w:tcW w:type="dxa" w:w="4200"/>
+            <w:shd w:fill="DCE6F1" w:color="auto" w:val="clear"/>
+            <w:tcMar>
+              <w:top w:type="dxa" w:w="80"/>
+              <w:left w:type="dxa" w:w="100"/>
+              <w:bottom w:type="dxa" w:w="80"/>
+              <w:right w:type="dxa" w:w="100"/>
+            </w:tcMar>
+            <w:vAlign w:val="center"/>
+          </w:tcPr>
+          <w:p>
+            <w:pPr>
+              <w:spacing w:line="240"/>
+            </w:pPr>
+            <w:r>
+              <w:rPr>
+                <w:rFonts w:ascii="Arial" w:cs="Arial" w:eastAsia="Arial" w:hAnsi="Arial"/>
+                <w:b/>
+                <w:bCs/>
+                <w:sz w:val="20"/>
+                <w:szCs w:val="20"/>
+              </w:rPr>
+              <w:t xml:space="preserve">HORAS FASE DE CENTRO</w:t>
+            </w:r>
+          </w:p>
+        </w:tc>
+        <w:tc>
+          <w:tcPr>
+            <w:tcW w:type="dxa" w:w="4200"/>
+            <w:shd w:fill="DCE6F1" w:color="auto" w:val="clear"/>
+            <w:tcMar>
+              <w:top w:type="dxa" w:w="80"/>
+              <w:left w:type="dxa" w:w="100"/>
+              <w:bottom w:type="dxa" w:w="80"/>
+              <w:right w:type="dxa" w:w="100"/>
+            </w:tcMar>
+            <w:vAlign w:val="center"/>
+          </w:tcPr>
+          <w:p>
+            <w:pPr>
+              <w:spacing w:line="240"/>
+            </w:pPr>
+            <w:r>
+              <w:rPr>
+                <w:rFonts w:ascii="Arial" w:cs="Arial" w:eastAsia="Arial" w:hAnsi="Arial"/>
+                <w:b/>
+                <w:bCs/>
+                <w:sz w:val="20"/>
+                <w:szCs w:val="20"/>
+              </w:rPr>
+              <w:t xml:space="preserve">HORAS FASE DE EMPRESA</w:t>
+            </w:r>
+          </w:p>
+        </w:tc>
+      </w:tr>
+      <w:tr>
+        <w:tc>
+          <w:tcPr>
+            <w:tcW w:type="dxa" w:w="5398"/>
+            <w:tcMar>
+              <w:top w:type="dxa" w:w="80"/>
+              <w:left w:type="dxa" w:w="100"/>
+              <w:bottom w:type="dxa" w:w="80"/>
+              <w:right w:type="dxa" w:w="100"/>
+            </w:tcMar>
+            <w:vAlign w:val="center"/>
+          </w:tcPr>
+          <w:p>
+            <w:pPr>
+              <w:spacing w:line="240"/>
+            </w:pPr>
+            <w:r>
+              <w:rPr>
+                <w:rFonts w:ascii="Arial" w:cs="Arial" w:eastAsia="Arial" w:hAnsi="Arial"/>
+                <w:sz w:val="20"/>
+                <w:szCs w:val="20"/>
+              </w:rPr>
+              <w:t xml:space="preserve">155</w:t>
+            </w:r>
+          </w:p>
+        </w:tc>
+        <w:tc>
+          <w:tcPr>
+            <w:tcW w:type="dxa" w:w="5398"/>
+            <w:tcMar>
+              <w:top w:type="dxa" w:w="80"/>
+              <w:left w:type="dxa" w:w="100"/>
+              <w:bottom w:type="dxa" w:w="80"/>
+              <w:right w:type="dxa" w:w="100"/>
+            </w:tcMar>
+            <w:vAlign w:val="center"/>
+          </w:tcPr>
+          <w:p>
+            <w:pPr>
+              <w:spacing w:line="240"/>
+            </w:pPr>
+            <w:r>
+              <w:rPr>
+                <w:rFonts w:ascii="Arial" w:cs="Arial" w:eastAsia="Arial" w:hAnsi="Arial"/>
+                <w:sz w:val="20"/>
+                <w:szCs w:val="20"/>
+              </w:rPr>
+              <w:t xml:space="preserve">155</w:t>
+            </w:r>
+          </w:p>
+        </w:tc>
+        <w:tc>
+          <w:tcPr>
+            <w:tcW w:type="dxa" w:w="5398"/>
+            <w:tcMar>
+              <w:top w:type="dxa" w:w="80"/>
+              <w:left w:type="dxa" w:w="100"/>
+              <w:bottom w:type="dxa" w:w="80"/>
+              <w:right w:type="dxa" w:w="100"/>
+            </w:tcMar>
+            <w:vAlign w:val="center"/>
+          </w:tcPr>
+          <w:p>
+            <w:pPr>
+              <w:spacing w:line="240"/>
+            </w:pPr>
+            <w:r>
+              <w:rPr>
+                <w:rFonts w:ascii="Arial" w:cs="Arial" w:eastAsia="Arial" w:hAnsi="Arial"/>
+                <w:sz w:val="20"/>
+                <w:szCs w:val="20"/>
+              </w:rPr>
+              <w:t xml:space="preserve">0 — el 100% de los RA se cubre en el centro (art. 7, RD 659/2023).</w:t>
+            </w:r>
+          </w:p>
+        </w:tc>
+      </w:tr>
+    </w:tbl>
+    <w:tbl>
+      <w:tblPr>
+        <w:tblW w:type="dxa" w:w="9598"/>
+        <w:tblBorders>
+          <w:top w:val="single" w:color="auto" w:sz="4"/>
+          <w:left w:val="single" w:color="auto" w:sz="4"/>
+          <w:bottom w:val="single" w:color="auto" w:sz="4"/>
+          <w:right w:val="single" w:color="auto" w:sz="4"/>
+          <w:insideH w:val="single" w:color="auto" w:sz="4"/>
+          <w:insideV w:val="single" w:color="auto" w:sz="4"/>
+        </w:tblBorders>
+      </w:tblPr>
+      <w:tblGrid>
+        <w:gridCol w:w="4200"/>
+        <w:gridCol w:w="5398"/>
+      </w:tblGrid>
+      <w:tr>
+        <w:tc>
+          <w:tcPr>
+            <w:tcW w:type="dxa" w:w="4200"/>
+            <w:shd w:fill="DCE6F1" w:color="auto" w:val="clear"/>
+            <w:tcMar>
+              <w:top w:type="dxa" w:w="80"/>
+              <w:left w:type="dxa" w:w="100"/>
+              <w:bottom w:type="dxa" w:w="80"/>
+              <w:right w:type="dxa" w:w="100"/>
+            </w:tcMar>
+            <w:vAlign w:val="center"/>
+          </w:tcPr>
+          <w:p>
+            <w:pPr>
+              <w:spacing w:line="240"/>
+            </w:pPr>
+            <w:r>
+              <w:rPr>
+                <w:rFonts w:ascii="Arial" w:cs="Arial" w:eastAsia="Arial" w:hAnsi="Arial"/>
+                <w:b/>
+                <w:bCs/>
+                <w:sz w:val="20"/>
+                <w:szCs w:val="20"/>
+              </w:rPr>
+              <w:t xml:space="preserve">HORAS SEMANALES</w:t>
+            </w:r>
+          </w:p>
+        </w:tc>
+        <w:tc>
+          <w:tcPr>
+            <w:tcW w:type="dxa" w:w="5398"/>
+            <w:tcMar>
+              <w:top w:type="dxa" w:w="80"/>
+              <w:left w:type="dxa" w:w="100"/>
+              <w:bottom w:type="dxa" w:w="80"/>
+              <w:right w:type="dxa" w:w="100"/>
+            </w:tcMar>
+            <w:vAlign w:val="center"/>
+          </w:tcPr>
+          <w:p>
+            <w:pPr>
+              <w:spacing w:line="240"/>
+            </w:pPr>
+            <w:r>
+              <w:rPr>
+                <w:rFonts w:ascii="Arial" w:cs="Arial" w:eastAsia="Arial" w:hAnsi="Arial"/>
+                <w:sz w:val="20"/>
+                <w:szCs w:val="20"/>
+              </w:rPr>
+              <w:t xml:space="preserve">5 horas/semana.</w:t>
+            </w:r>
+          </w:p>
+        </w:tc>
+      </w:tr>
+    </w:tbl>
     <w:p>
       <w:pPr>
         <w:pStyle w:val="Heading2"/>

</xml_diff>

<commit_message>
Cerrar el punto 1 completo (1.1-1.5) de la segunda entrega
Añade 1.3 (Justificación, con las menciones a los Anexos VI/XIX de la
convocatoria marcadas en rojo como dudosas, y "evaluaciones" en vez de
"trimestres" sin dar por hecho su número), 1.4 (Referencias
legislativas, con tres citas de la CARM verificadas) y 1.5 (Fuentes
sociales, con las 4 fuentes del currículo adaptadas al módulo y
citando a César Coll).

Co-Authored-By: Claude Sonnet 5 <noreply@anthropic.com>
Claude-Session: https://claude.ai/code/session_018x8SAWzLDt9GJuoqda3PdZ
</commit_message>
<xml_diff>
--- a/preparacion-oposicion-2027/materiales/Plantilla_Entrega2_0017_Habilidades_Sociales.docx
+++ b/preparacion-oposicion-2027/materiales/Plantilla_Entrega2_0017_Habilidades_Sociales.docx
@@ -1133,18 +1133,258 @@
     </w:p>
     <w:p>
       <w:pPr>
-        <w:spacing w:after="240" w:line="240"/>
-      </w:pPr>
-      <w:r>
-        <w:rPr>
-          <w:rFonts w:ascii="Arial" w:cs="Arial" w:eastAsia="Arial" w:hAnsi="Arial"/>
-          <w:i/>
-          <w:iCs/>
-          <w:color w:val="808080"/>
-          <w:sz w:val="22"/>
-          <w:szCs w:val="22"/>
-        </w:rPr>
-        <w:t xml:space="preserve">[Pendiente de redactar]</w:t>
+        <w:spacing w:after="160" w:line="240"/>
+      </w:pPr>
+      <w:r>
+        <w:rPr>
+          <w:rFonts w:ascii="Arial" w:cs="Arial" w:eastAsia="Arial" w:hAnsi="Arial"/>
+          <w:b w:val="false"/>
+          <w:bCs w:val="false"/>
+          <w:i w:val="false"/>
+          <w:iCs w:val="false"/>
+          <w:sz w:val="22"/>
+          <w:szCs w:val="22"/>
+        </w:rPr>
+        <w:t xml:space="preserve">La elaboración de esta programación didáctica responde, en primer lugar, al mandato de la propia convocatoria del procedimiento selectivo: la Orden de convocatoria exige a quienes aspiran a ingresar en el Cuerpo de Profesores de Enseñanza Secundaria la presentación de una programación didáctica como parte de la fase de oposición, conforme a lo establecido en sus </w:t>
+      </w:r>
+      <w:r>
+        <w:rPr>
+          <w:rFonts w:ascii="Arial" w:cs="Arial" w:eastAsia="Arial" w:hAnsi="Arial"/>
+          <w:b/>
+          <w:bCs/>
+          <w:color w:val="C00000"/>
+          <w:sz w:val="22"/>
+          <w:szCs w:val="22"/>
+        </w:rPr>
+        <w:t xml:space="preserve">Anexos VI (criterios de valoración) y XIX (aspectos formales) [⚠ DUDOSO: numeración de la Orden de convocatoria de 20/11/2024, para la convocatoria 2025 — pendiente de confirmar que se mantiene igual cuando se publique la Orden de la próxima convocatoria]</w:t>
+      </w:r>
+      <w:r>
+        <w:rPr>
+          <w:rFonts w:ascii="Arial" w:cs="Arial" w:eastAsia="Arial" w:hAnsi="Arial"/>
+          <w:b w:val="false"/>
+          <w:bCs w:val="false"/>
+          <w:i w:val="false"/>
+          <w:iCs w:val="false"/>
+          <w:sz w:val="22"/>
+          <w:szCs w:val="22"/>
+        </w:rPr>
+        <w:t xml:space="preserve">. Superar este requisito es, por tanto, condición necesaria para continuar en el proceso selectivo.</w:t>
+      </w:r>
+    </w:p>
+    <w:p>
+      <w:pPr>
+        <w:spacing w:after="160" w:line="240"/>
+      </w:pPr>
+      <w:r>
+        <w:rPr>
+          <w:rFonts w:ascii="Arial" w:cs="Arial" w:eastAsia="Arial" w:hAnsi="Arial"/>
+          <w:b w:val="false"/>
+          <w:bCs w:val="false"/>
+          <w:i w:val="false"/>
+          <w:iCs w:val="false"/>
+          <w:sz w:val="22"/>
+          <w:szCs w:val="22"/>
+        </w:rPr>
+        <w:t xml:space="preserve">Más allá de esta exigencia formal, elaborar esta programación permite situar la intervención docente dentro de los distintos niveles de concreción curricular que articulan el sistema educativo español, y justificar por qué es el profesorado —y no únicamente la Administración— quien debe desarrollar y adaptar el currículo a la realidad concreta de su alumnado. El concepto de autonomía pedagógica encuentra aquí su mayor respaldo: todo centro educativo dispone, conforme a la normativa vigente, de autonomía para elaborar, aprobar y ejecutar sus propios documentos de planificación, siempre dentro de los parámetros mínimos fijados a nivel estatal y autonómico. Esta programación didáctica transita, en consecuencia, a través de los siguientes niveles de concreción:</w:t>
+      </w:r>
+    </w:p>
+    <w:p>
+      <w:pPr>
+        <w:spacing w:after="160" w:line="240"/>
+      </w:pPr>
+      <w:r>
+        <w:rPr>
+          <w:rFonts w:ascii="Arial" w:cs="Arial" w:eastAsia="Arial" w:hAnsi="Arial"/>
+          <w:b w:val="false"/>
+          <w:bCs w:val="false"/>
+          <w:i w:val="false"/>
+          <w:iCs w:val="false"/>
+          <w:sz w:val="22"/>
+          <w:szCs w:val="22"/>
+        </w:rPr>
+        <w:t xml:space="preserve">– La Ley Orgánica 3/2020, de 29 de diciembre, por la que se modifica la Ley Orgánica 2/2006, de 3 de mayo, de Educación (LOMLOE), como marco normativo de referencia a nivel estatal.</w:t>
+      </w:r>
+    </w:p>
+    <w:p>
+      <w:pPr>
+        <w:spacing w:after="160" w:line="240"/>
+      </w:pPr>
+      <w:r>
+        <w:rPr>
+          <w:rFonts w:ascii="Arial" w:cs="Arial" w:eastAsia="Arial" w:hAnsi="Arial"/>
+          <w:b w:val="false"/>
+          <w:bCs w:val="false"/>
+          <w:i w:val="false"/>
+          <w:iCs w:val="false"/>
+          <w:sz w:val="22"/>
+          <w:szCs w:val="22"/>
+        </w:rPr>
+        <w:t xml:space="preserve">– El Real Decreto que establece el título (Real Decreto 1074/2012, de 13 de julio, modificado por el Real Decreto 289/2023, de 18 de abril) y la Orden de currículo autonómica (Orden de 21 de septiembre de 2026, de la Consejería de Educación y Formación Profesional).</w:t>
+      </w:r>
+    </w:p>
+    <w:p>
+      <w:pPr>
+        <w:spacing w:after="160" w:line="240"/>
+      </w:pPr>
+      <w:r>
+        <w:rPr>
+          <w:rFonts w:ascii="Arial" w:cs="Arial" w:eastAsia="Arial" w:hAnsi="Arial"/>
+          <w:b w:val="false"/>
+          <w:bCs w:val="false"/>
+          <w:i w:val="false"/>
+          <w:iCs w:val="false"/>
+          <w:sz w:val="22"/>
+          <w:szCs w:val="22"/>
+        </w:rPr>
+        <w:t xml:space="preserve">– El Proyecto Educativo de Centro, la Programación General Anual y la Memoria Anual del centro educativo, como documentos institucionales que concretan esas directrices a la realidad de cada centro.</w:t>
+      </w:r>
+    </w:p>
+    <w:p>
+      <w:pPr>
+        <w:spacing w:after="160" w:line="240"/>
+      </w:pPr>
+      <w:r>
+        <w:rPr>
+          <w:rFonts w:ascii="Arial" w:cs="Arial" w:eastAsia="Arial" w:hAnsi="Arial"/>
+          <w:b w:val="false"/>
+          <w:bCs w:val="false"/>
+          <w:i w:val="false"/>
+          <w:iCs w:val="false"/>
+          <w:sz w:val="22"/>
+          <w:szCs w:val="22"/>
+        </w:rPr>
+        <w:t xml:space="preserve">– La propia programación docente, referida al módulo y al aula.</w:t>
+      </w:r>
+    </w:p>
+    <w:p>
+      <w:pPr>
+        <w:spacing w:after="160" w:line="240"/>
+      </w:pPr>
+      <w:r>
+        <w:rPr>
+          <w:rFonts w:ascii="Arial" w:cs="Arial" w:eastAsia="Arial" w:hAnsi="Arial"/>
+          <w:b w:val="false"/>
+          <w:bCs w:val="false"/>
+          <w:i w:val="false"/>
+          <w:iCs w:val="false"/>
+          <w:sz w:val="22"/>
+          <w:szCs w:val="22"/>
+        </w:rPr>
+        <w:t xml:space="preserve">– Y, en último nivel de concreción, el alumnado, con sus necesidades específicas de apoyo educativo (ACNEAE), al que finalmente debe adaptarse toda la planificación anterior.</w:t>
+      </w:r>
+    </w:p>
+    <w:p>
+      <w:pPr>
+        <w:spacing w:after="160" w:line="240"/>
+      </w:pPr>
+      <w:r>
+        <w:rPr>
+          <w:rFonts w:ascii="Arial" w:cs="Arial" w:eastAsia="Arial" w:hAnsi="Arial"/>
+          <w:b w:val="false"/>
+          <w:bCs w:val="false"/>
+          <w:i w:val="false"/>
+          <w:iCs w:val="false"/>
+          <w:sz w:val="22"/>
+          <w:szCs w:val="22"/>
+        </w:rPr>
+        <w:t xml:space="preserve">Esta programación didáctica sirve, en definitiva, como el instrumento que permite planificar de forma coherente y fundamentada el proceso de enseñanza-aprendizaje del módulo durante un curso académico completo, garantizando que los resultados de aprendizaje y criterios de evaluación establecidos normativamente se trabajen de manera ordenada, progresiva y evaluable, y sirviendo como referencia tanto para la propia práctica docente como para su defensa ante el tribunal.</w:t>
+      </w:r>
+    </w:p>
+    <w:p>
+      <w:pPr>
+        <w:spacing w:after="160" w:line="240"/>
+      </w:pPr>
+      <w:r>
+        <w:rPr>
+          <w:rFonts w:ascii="Arial" w:cs="Arial" w:eastAsia="Arial" w:hAnsi="Arial"/>
+          <w:b w:val="false"/>
+          <w:bCs w:val="false"/>
+          <w:i w:val="false"/>
+          <w:iCs w:val="false"/>
+          <w:sz w:val="22"/>
+          <w:szCs w:val="22"/>
+        </w:rPr>
+        <w:t xml:space="preserve">En cuanto a la importancia del módulo dentro del ciclo formativo, 0017. Habilidades sociales dota al alumnado de competencias de comunicación, inteligencia emocional, dinamización de grupos, conducción de reuniones y gestión de conflictos que resultan transversales al resto de módulos del título de Técnico Superior en Integración Social, y que son, además, condición necesaria para el desempeño de las funciones de intervención social que definen la competencia general del ciclo. Su superación contribuye, por tanto, tanto a la adquisición del resto de aprendizajes del ciclo como a los objetivos generales de la etapa de Formación Profesional.</w:t>
+      </w:r>
+    </w:p>
+    <w:p>
+      <w:pPr>
+        <w:spacing w:after="160" w:line="240"/>
+      </w:pPr>
+      <w:r>
+        <w:rPr>
+          <w:rFonts w:ascii="Arial" w:cs="Arial" w:eastAsia="Arial" w:hAnsi="Arial"/>
+          <w:b w:val="false"/>
+          <w:bCs w:val="false"/>
+          <w:i w:val="false"/>
+          <w:iCs w:val="false"/>
+          <w:sz w:val="22"/>
+          <w:szCs w:val="22"/>
+        </w:rPr>
+        <w:t xml:space="preserve">Respecto a la relación con las Unidades de Trabajo, esta programación se organiza en un mínimo de 12 UT —conforme exige el </w:t>
+      </w:r>
+      <w:r>
+        <w:rPr>
+          <w:rFonts w:ascii="Arial" w:cs="Arial" w:eastAsia="Arial" w:hAnsi="Arial"/>
+          <w:b/>
+          <w:bCs/>
+          <w:color w:val="C00000"/>
+          <w:sz w:val="22"/>
+          <w:szCs w:val="22"/>
+        </w:rPr>
+        <w:t xml:space="preserve">Anexo XIX [⚠ ver nota anterior]</w:t>
+      </w:r>
+      <w:r>
+        <w:rPr>
+          <w:rFonts w:ascii="Arial" w:cs="Arial" w:eastAsia="Arial" w:hAnsi="Arial"/>
+          <w:b w:val="false"/>
+          <w:bCs w:val="false"/>
+          <w:i w:val="false"/>
+          <w:iCs w:val="false"/>
+          <w:sz w:val="22"/>
+          <w:szCs w:val="22"/>
+        </w:rPr>
+        <w:t xml:space="preserve"> de la Orden de convocatoria—, resultado de repartir los contenidos y criterios de evaluación de los 5 Resultados de Aprendizaje del módulo en bloques de trabajo coherentes y de extensión acotada. Su distribución a lo largo de las evaluaciones del curso académico se detallará en el apartado correspondiente de esta programación (punto 4); el número exacto de evaluaciones está pendiente de concretar, ya que el calendario del alumnado de 2.º curso queda condicionado por el inicio de la fase de formación en el centro de trabajo (FCT), previsto habitualmente en torno a los meses de marzo-abril.</w:t>
+      </w:r>
+    </w:p>
+    <w:p>
+      <w:pPr>
+        <w:spacing w:after="160" w:line="240"/>
+      </w:pPr>
+      <w:r>
+        <w:rPr>
+          <w:rFonts w:ascii="Arial" w:cs="Arial" w:eastAsia="Arial" w:hAnsi="Arial"/>
+          <w:b w:val="false"/>
+          <w:bCs w:val="false"/>
+          <w:i w:val="false"/>
+          <w:iCs w:val="false"/>
+          <w:sz w:val="22"/>
+          <w:szCs w:val="22"/>
+        </w:rPr>
+        <w:t xml:space="preserve">Por último, no debe perderse de vista que esta programación se redacta con vistas a una convocatoria de oposición: su finalidad inmediata es superar el proceso selectivo de acceso al Cuerpo de Profesores de Enseñanza Secundaria, por lo que su elaboración, además de responder a criterios pedagógicos y curriculares, atiende también a los criterios de valoración establecidos por el tribunal en el </w:t>
+      </w:r>
+      <w:r>
+        <w:rPr>
+          <w:rFonts w:ascii="Arial" w:cs="Arial" w:eastAsia="Arial" w:hAnsi="Arial"/>
+          <w:b/>
+          <w:bCs/>
+          <w:color w:val="C00000"/>
+          <w:sz w:val="22"/>
+          <w:szCs w:val="22"/>
+        </w:rPr>
+        <w:t xml:space="preserve">Anexo VI [⚠ ver nota anterior]</w:t>
+      </w:r>
+      <w:r>
+        <w:rPr>
+          <w:rFonts w:ascii="Arial" w:cs="Arial" w:eastAsia="Arial" w:hAnsi="Arial"/>
+          <w:b w:val="false"/>
+          <w:bCs w:val="false"/>
+          <w:i w:val="false"/>
+          <w:iCs w:val="false"/>
+          <w:sz w:val="22"/>
+          <w:szCs w:val="22"/>
+        </w:rPr>
+        <w:t xml:space="preserve"> de la Orden de convocatoria.</w:t>
       </w:r>
     </w:p>
     <w:p>
@@ -1165,18 +1405,257 @@
     </w:p>
     <w:p>
       <w:pPr>
-        <w:spacing w:after="240" w:line="240"/>
-      </w:pPr>
-      <w:r>
-        <w:rPr>
-          <w:rFonts w:ascii="Arial" w:cs="Arial" w:eastAsia="Arial" w:hAnsi="Arial"/>
+        <w:spacing w:after="160" w:line="240"/>
+      </w:pPr>
+      <w:r>
+        <w:rPr>
+          <w:rFonts w:ascii="Arial" w:cs="Arial" w:eastAsia="Arial" w:hAnsi="Arial"/>
+          <w:b w:val="false"/>
+          <w:bCs w:val="false"/>
+          <w:i w:val="false"/>
+          <w:iCs w:val="false"/>
+          <w:sz w:val="22"/>
+          <w:szCs w:val="22"/>
+        </w:rPr>
+        <w:t xml:space="preserve">Para el desarrollo de esta programación se han tomado como pilares básicos los siguientes referentes legislativos, ordenados de mayor a menor rango normativo:</w:t>
+      </w:r>
+    </w:p>
+    <w:p>
+      <w:pPr>
+        <w:spacing w:after="100" w:before="160" w:line="240"/>
+      </w:pPr>
+      <w:r>
+        <w:rPr>
+          <w:rFonts w:ascii="Arial" w:cs="Arial" w:eastAsia="Arial" w:hAnsi="Arial"/>
+          <w:b/>
+          <w:bCs/>
           <w:i/>
           <w:iCs/>
-          <w:color w:val="808080"/>
-          <w:sz w:val="22"/>
-          <w:szCs w:val="22"/>
-        </w:rPr>
-        <w:t xml:space="preserve">[Pendiente de redactar]</w:t>
+          <w:sz w:val="22"/>
+          <w:szCs w:val="22"/>
+        </w:rPr>
+        <w:t xml:space="preserve">Normativa educativa general</w:t>
+      </w:r>
+    </w:p>
+    <w:p>
+      <w:pPr>
+        <w:spacing w:after="160" w:line="240"/>
+      </w:pPr>
+      <w:r>
+        <w:rPr>
+          <w:rFonts w:ascii="Arial" w:cs="Arial" w:eastAsia="Arial" w:hAnsi="Arial"/>
+          <w:b w:val="false"/>
+          <w:bCs w:val="false"/>
+          <w:i w:val="false"/>
+          <w:iCs w:val="false"/>
+          <w:sz w:val="22"/>
+          <w:szCs w:val="22"/>
+        </w:rPr>
+        <w:t xml:space="preserve">– Agenda 2030 — Marco estratégico europeo de educación — ODS4, Educación de calidad.</w:t>
+      </w:r>
+    </w:p>
+    <w:p>
+      <w:pPr>
+        <w:spacing w:after="160" w:line="240"/>
+      </w:pPr>
+      <w:r>
+        <w:rPr>
+          <w:rFonts w:ascii="Arial" w:cs="Arial" w:eastAsia="Arial" w:hAnsi="Arial"/>
+          <w:b w:val="false"/>
+          <w:bCs w:val="false"/>
+          <w:i w:val="false"/>
+          <w:iCs w:val="false"/>
+          <w:sz w:val="22"/>
+          <w:szCs w:val="22"/>
+        </w:rPr>
+        <w:t xml:space="preserve">– Ley Orgánica 3/2020, de 29 de diciembre, por la que se modifica la Ley Orgánica 2/2006, de 3 de mayo, de Educación (LOMLOE).</w:t>
+      </w:r>
+    </w:p>
+    <w:p>
+      <w:pPr>
+        <w:spacing w:after="100" w:before="160" w:line="240"/>
+      </w:pPr>
+      <w:r>
+        <w:rPr>
+          <w:rFonts w:ascii="Arial" w:cs="Arial" w:eastAsia="Arial" w:hAnsi="Arial"/>
+          <w:b/>
+          <w:bCs/>
+          <w:i/>
+          <w:iCs/>
+          <w:sz w:val="22"/>
+          <w:szCs w:val="22"/>
+        </w:rPr>
+        <w:t xml:space="preserve">Normativa de Formación Profesional</w:t>
+      </w:r>
+    </w:p>
+    <w:p>
+      <w:pPr>
+        <w:spacing w:after="160" w:line="240"/>
+      </w:pPr>
+      <w:r>
+        <w:rPr>
+          <w:rFonts w:ascii="Arial" w:cs="Arial" w:eastAsia="Arial" w:hAnsi="Arial"/>
+          <w:b w:val="false"/>
+          <w:bCs w:val="false"/>
+          <w:i w:val="false"/>
+          <w:iCs w:val="false"/>
+          <w:sz w:val="22"/>
+          <w:szCs w:val="22"/>
+        </w:rPr>
+        <w:t xml:space="preserve">– Ley Orgánica 3/2022, de 31 de marzo, de ordenación e integración de la Formación Profesional.</w:t>
+      </w:r>
+    </w:p>
+    <w:p>
+      <w:pPr>
+        <w:spacing w:after="160" w:line="240"/>
+      </w:pPr>
+      <w:r>
+        <w:rPr>
+          <w:rFonts w:ascii="Arial" w:cs="Arial" w:eastAsia="Arial" w:hAnsi="Arial"/>
+          <w:b w:val="false"/>
+          <w:bCs w:val="false"/>
+          <w:i w:val="false"/>
+          <w:iCs w:val="false"/>
+          <w:sz w:val="22"/>
+          <w:szCs w:val="22"/>
+        </w:rPr>
+        <w:t xml:space="preserve">– Real Decreto 659/2023, de 18 de julio, por el que se desarrolla la ordenación del Sistema de Formación Profesional.</w:t>
+      </w:r>
+    </w:p>
+    <w:p>
+      <w:pPr>
+        <w:spacing w:after="160" w:line="240"/>
+      </w:pPr>
+      <w:r>
+        <w:rPr>
+          <w:rFonts w:ascii="Arial" w:cs="Arial" w:eastAsia="Arial" w:hAnsi="Arial"/>
+          <w:b w:val="false"/>
+          <w:bCs w:val="false"/>
+          <w:i w:val="false"/>
+          <w:iCs w:val="false"/>
+          <w:sz w:val="22"/>
+          <w:szCs w:val="22"/>
+        </w:rPr>
+        <w:t xml:space="preserve">– Resolución de 5 de julio de 2024, de la Dirección General de Formación Profesional, Enseñanzas de Régimen Especial y Educación Permanente, por la que se dictan instrucciones sobre la ordenación y organización de los ciclos formativos de grado medio y de grado superior en la Comunidad Autónoma de la Región de Murcia, en aplicación del Real Decreto 659/2023, de 18 de julio.</w:t>
+      </w:r>
+    </w:p>
+    <w:p>
+      <w:pPr>
+        <w:spacing w:after="160" w:line="240"/>
+      </w:pPr>
+      <w:r>
+        <w:rPr>
+          <w:rFonts w:ascii="Arial" w:cs="Arial" w:eastAsia="Arial" w:hAnsi="Arial"/>
+          <w:b w:val="false"/>
+          <w:bCs w:val="false"/>
+          <w:i w:val="false"/>
+          <w:iCs w:val="false"/>
+          <w:sz w:val="22"/>
+          <w:szCs w:val="22"/>
+        </w:rPr>
+        <w:t xml:space="preserve">– Orden de 1 de junio de 2006, de la Consejería de Educación y Cultura, por la que se regula el procedimiento que garantiza la objetividad en la evaluación de los alumnos de Educación Secundaria y Formación Profesional de Grado Superior.</w:t>
+      </w:r>
+    </w:p>
+    <w:p>
+      <w:pPr>
+        <w:spacing w:after="100" w:before="160" w:line="240"/>
+      </w:pPr>
+      <w:r>
+        <w:rPr>
+          <w:rFonts w:ascii="Arial" w:cs="Arial" w:eastAsia="Arial" w:hAnsi="Arial"/>
+          <w:b/>
+          <w:bCs/>
+          <w:i/>
+          <w:iCs/>
+          <w:sz w:val="22"/>
+          <w:szCs w:val="22"/>
+        </w:rPr>
+        <w:t xml:space="preserve">Normativa del Ciclo Formativo</w:t>
+      </w:r>
+    </w:p>
+    <w:p>
+      <w:pPr>
+        <w:spacing w:after="160" w:line="240"/>
+      </w:pPr>
+      <w:r>
+        <w:rPr>
+          <w:rFonts w:ascii="Arial" w:cs="Arial" w:eastAsia="Arial" w:hAnsi="Arial"/>
+          <w:b w:val="false"/>
+          <w:bCs w:val="false"/>
+          <w:i w:val="false"/>
+          <w:iCs w:val="false"/>
+          <w:sz w:val="22"/>
+          <w:szCs w:val="22"/>
+        </w:rPr>
+        <w:t xml:space="preserve">– Real Decreto 1074/2012, de 13 de julio, por el que se establece el título de Técnico Superior en Integración Social y se fijan sus enseñanzas mínimas, modificado por el Real Decreto 289/2023, de 18 de abril.</w:t>
+      </w:r>
+    </w:p>
+    <w:p>
+      <w:pPr>
+        <w:spacing w:after="160" w:line="240"/>
+      </w:pPr>
+      <w:r>
+        <w:rPr>
+          <w:rFonts w:ascii="Arial" w:cs="Arial" w:eastAsia="Arial" w:hAnsi="Arial"/>
+          <w:b w:val="false"/>
+          <w:bCs w:val="false"/>
+          <w:i w:val="false"/>
+          <w:iCs w:val="false"/>
+          <w:sz w:val="22"/>
+          <w:szCs w:val="22"/>
+        </w:rPr>
+        <w:t xml:space="preserve">– Orden de 21 de septiembre de 2026, de la Consejería de Educación y Formación Profesional, por la que se establecen los currículos de los títulos de los ciclos formativos de grado superior y se regulan determinados aspectos organizativos en la Comunidad Autónoma de la Región de Murcia.</w:t>
+      </w:r>
+    </w:p>
+    <w:p>
+      <w:pPr>
+        <w:spacing w:after="100" w:before="160" w:line="240"/>
+      </w:pPr>
+      <w:r>
+        <w:rPr>
+          <w:rFonts w:ascii="Arial" w:cs="Arial" w:eastAsia="Arial" w:hAnsi="Arial"/>
+          <w:b/>
+          <w:bCs/>
+          <w:i/>
+          <w:iCs/>
+          <w:sz w:val="22"/>
+          <w:szCs w:val="22"/>
+        </w:rPr>
+        <w:t xml:space="preserve">Normativa de educación inclusiva — Atención a las diferencias individuales</w:t>
+      </w:r>
+    </w:p>
+    <w:p>
+      <w:pPr>
+        <w:spacing w:after="160" w:line="240"/>
+      </w:pPr>
+      <w:r>
+        <w:rPr>
+          <w:rFonts w:ascii="Arial" w:cs="Arial" w:eastAsia="Arial" w:hAnsi="Arial"/>
+          <w:b w:val="false"/>
+          <w:bCs w:val="false"/>
+          <w:i w:val="false"/>
+          <w:iCs w:val="false"/>
+          <w:sz w:val="22"/>
+          <w:szCs w:val="22"/>
+        </w:rPr>
+        <w:t xml:space="preserve">– Decreto n.º 359/2009, de 30 de octubre, por el que se establece y regula la respuesta educativa a la diversidad del alumnado en la Comunidad Autónoma de la Región de Murcia.</w:t>
+      </w:r>
+    </w:p>
+    <w:p>
+      <w:pPr>
+        <w:spacing w:after="160" w:line="240"/>
+      </w:pPr>
+      <w:r>
+        <w:rPr>
+          <w:rFonts w:ascii="Arial" w:cs="Arial" w:eastAsia="Arial" w:hAnsi="Arial"/>
+          <w:b w:val="false"/>
+          <w:bCs w:val="false"/>
+          <w:i w:val="false"/>
+          <w:iCs w:val="false"/>
+          <w:sz w:val="22"/>
+          <w:szCs w:val="22"/>
+        </w:rPr>
+        <w:t xml:space="preserve">– Orden de 4 de junio de 2010, de la Consejería de Educación, Formación y Empleo, por la que se regula el Plan de Atención a la Diversidad de los Centros Públicos y Centros Privados Concertados de la Región de Murcia.</w:t>
       </w:r>
     </w:p>
     <w:p>
@@ -1197,18 +1676,121 @@
     </w:p>
     <w:p>
       <w:pPr>
-        <w:spacing w:after="240" w:line="240"/>
-      </w:pPr>
-      <w:r>
-        <w:rPr>
-          <w:rFonts w:ascii="Arial" w:cs="Arial" w:eastAsia="Arial" w:hAnsi="Arial"/>
-          <w:i/>
-          <w:iCs/>
-          <w:color w:val="808080"/>
-          <w:sz w:val="22"/>
-          <w:szCs w:val="22"/>
-        </w:rPr>
-        <w:t xml:space="preserve">[Pendiente de redactar]</w:t>
+        <w:spacing w:after="160" w:line="240"/>
+      </w:pPr>
+      <w:r>
+        <w:rPr>
+          <w:rFonts w:ascii="Arial" w:cs="Arial" w:eastAsia="Arial" w:hAnsi="Arial"/>
+          <w:b w:val="false"/>
+          <w:bCs w:val="false"/>
+          <w:i w:val="false"/>
+          <w:iCs w:val="false"/>
+          <w:sz w:val="22"/>
+          <w:szCs w:val="22"/>
+        </w:rPr>
+        <w:t xml:space="preserve">Esta programación didáctica no se elabora al margen de su contexto, sino en relación directa con el marco social, científico, pedagógico y psicológico en el que se enmarca la intervención educativa. Para situarla adecuadamente, resulta necesario conectar lo programado con las nuevas necesidades y demandas sociales del modelo social y laboral actual, así como con las tendencias, intereses y peculiaridades que de ellos se derivan.</w:t>
+      </w:r>
+    </w:p>
+    <w:p>
+      <w:pPr>
+        <w:spacing w:after="160" w:line="240"/>
+      </w:pPr>
+      <w:r>
+        <w:rPr>
+          <w:rFonts w:ascii="Arial" w:cs="Arial" w:eastAsia="Arial" w:hAnsi="Arial"/>
+          <w:b w:val="false"/>
+          <w:bCs w:val="false"/>
+          <w:i w:val="false"/>
+          <w:iCs w:val="false"/>
+          <w:sz w:val="22"/>
+          <w:szCs w:val="22"/>
+        </w:rPr>
+        <w:t xml:space="preserve">No podemos perder de vista la importancia de la Formación Profesional en la actualidad como vía de cualificación y de acceso al mundo laboral, y de manera más específica, el impacto sociolaboral de la familia profesional de Servicios Socioculturales y a la Comunidad y del ciclo formativo de Integración Social, así como el constructo teórico, normativo y sociolaboral que se desprende de este sector. En este sentido, resulta especialmente pertinente atender a la actual y necesaria transformación de los procesos educativos originada en la búsqueda del desarrollo de nuevas habilidades y competencias que los profesionales del siglo XXI tienen que adquirir.</w:t>
+      </w:r>
+    </w:p>
+    <w:p>
+      <w:pPr>
+        <w:spacing w:after="160" w:line="240"/>
+      </w:pPr>
+      <w:r>
+        <w:rPr>
+          <w:rFonts w:ascii="Arial" w:cs="Arial" w:eastAsia="Arial" w:hAnsi="Arial"/>
+          <w:b w:val="false"/>
+          <w:bCs w:val="false"/>
+          <w:i w:val="false"/>
+          <w:iCs w:val="false"/>
+          <w:sz w:val="22"/>
+          <w:szCs w:val="22"/>
+        </w:rPr>
+        <w:t xml:space="preserve">Siguiendo el planteamiento clásico de César Coll sobre las fuentes del currículo, esta programación didáctica se sustenta en cuatro fuentes que influyen de manera decisiva en su elaboración:</w:t>
+      </w:r>
+    </w:p>
+    <w:p>
+      <w:pPr>
+        <w:spacing w:after="160" w:line="240"/>
+      </w:pPr>
+      <w:r>
+        <w:rPr>
+          <w:rFonts w:ascii="Arial" w:cs="Arial" w:eastAsia="Arial" w:hAnsi="Arial"/>
+          <w:b w:val="false"/>
+          <w:bCs w:val="false"/>
+          <w:i w:val="false"/>
+          <w:iCs w:val="false"/>
+          <w:sz w:val="22"/>
+          <w:szCs w:val="22"/>
+        </w:rPr>
+        <w:t xml:space="preserve">– Epistemológica: tiene en cuenta las características y fundamentos del saber, la lógica interna de la materia y la evolución de las ideas científicas. En el caso del módulo 0017. Habilidades sociales, esta fuente remite al cuerpo de conocimiento propio de la psicología social, la teoría de la comunicación y la dinámica de grupos sobre el que se construyen sus cinco Resultados de Aprendizaje.</w:t>
+      </w:r>
+    </w:p>
+    <w:p>
+      <w:pPr>
+        <w:spacing w:after="160" w:line="240"/>
+      </w:pPr>
+      <w:r>
+        <w:rPr>
+          <w:rFonts w:ascii="Arial" w:cs="Arial" w:eastAsia="Arial" w:hAnsi="Arial"/>
+          <w:b w:val="false"/>
+          <w:bCs w:val="false"/>
+          <w:i w:val="false"/>
+          <w:iCs w:val="false"/>
+          <w:sz w:val="22"/>
+          <w:szCs w:val="22"/>
+        </w:rPr>
+        <w:t xml:space="preserve">– Sociológica: recoge las características de la sociedad y los aspectos fundamentales de su organización y dinámica, así como las demandas sociales al sistema educativo. Atendiendo al informe Delors y al informe de la UNESCO «Reinventar juntos nuestros futuros», conviene dirigir los procesos de enseñanza hacia los cuatro pilares del desarrollo ciudadano —aprender a conocer, aprender a hacer, aprender a ser y aprender a estar—, a los que se suma la metacompetencia «aprender a cuidar y transformar». Esta fuente resulta especialmente pertinente en un módulo como el que nos ocupa, cuyo propio objeto de estudio —las habilidades sociales— se encuadra dentro de las denominadas soft skills que el CEDEFOP (Centro Europeo para el Desarrollo de la Formación Profesional) señala como imprescindibles para los profesionales del siglo XXI.</w:t>
+      </w:r>
+    </w:p>
+    <w:p>
+      <w:pPr>
+        <w:spacing w:after="160" w:line="240"/>
+      </w:pPr>
+      <w:r>
+        <w:rPr>
+          <w:rFonts w:ascii="Arial" w:cs="Arial" w:eastAsia="Arial" w:hAnsi="Arial"/>
+          <w:b w:val="false"/>
+          <w:bCs w:val="false"/>
+          <w:i w:val="false"/>
+          <w:iCs w:val="false"/>
+          <w:sz w:val="22"/>
+          <w:szCs w:val="22"/>
+        </w:rPr>
+        <w:t xml:space="preserve">– Pedagógica: aporta las aplicaciones didácticas, la práctica educativa y las finalidades de la Educación que orientan la metodología y las estrategias de enseñanza-aprendizaje de esta programación.</w:t>
+      </w:r>
+    </w:p>
+    <w:p>
+      <w:pPr>
+        <w:spacing w:after="160" w:line="240"/>
+      </w:pPr>
+      <w:r>
+        <w:rPr>
+          <w:rFonts w:ascii="Arial" w:cs="Arial" w:eastAsia="Arial" w:hAnsi="Arial"/>
+          <w:b w:val="false"/>
+          <w:bCs w:val="false"/>
+          <w:i w:val="false"/>
+          <w:iCs w:val="false"/>
+          <w:sz w:val="22"/>
+          <w:szCs w:val="22"/>
+        </w:rPr>
+        <w:t xml:space="preserve">– Psicológica: proporciona los datos sobre las características de los sujetos a los que va dirigida la programación, su momento evolutivo y los principios de cómo ha de producirse el aprendizaje, que se desarrollarán con mayor detalle en el apartado de Contextualización.</w:t>
       </w:r>
     </w:p>
     <w:p>

</xml_diff>

<commit_message>
Cerrar el punto 2.1 Características del centro
Redacta el 2.1 (IES Poeta Julian Andugar, Santomera) con datos del PEC,
mas hallazgos verificados tras investigacion adicional: participacion
real en Erasmus+ (ECHE 2021-2027, proyecto KA131 para Grado Superior,
fuente web del centro), plantilla organica real (Orden 3/03/2026 BORM,
77 puestos), y la distincion normativa entre las especialidades
"Servicios a la Comunidad" e "Intervencion Sociocomunitaria" (son
especialidades distintas, RD 276/2007 Anexo V). Quedan marcados como
pendientes de confirmar: ratio del grupo, numero exacto de docentes de
la especialidad/departamento, e instalaciones del centro.

Co-Authored-By: Claude Sonnet 5 <noreply@anthropic.com>
Claude-Session: https://claude.ai/code/session_018x8SAWzLDt9GJuoqda3PdZ
</commit_message>
<xml_diff>
--- a/preparacion-oposicion-2027/materiales/Plantilla_Entrega2_0017_Habilidades_Sociales.docx
+++ b/preparacion-oposicion-2027/materiales/Plantilla_Entrega2_0017_Habilidades_Sociales.docx
@@ -1832,13 +1832,116 @@
       <w:r>
         <w:rPr>
           <w:rFonts w:ascii="Arial" w:cs="Arial" w:eastAsia="Arial" w:hAnsi="Arial"/>
-          <w:i/>
-          <w:iCs/>
-          <w:color w:val="808080"/>
-          <w:sz w:val="22"/>
-          <w:szCs w:val="22"/>
-        </w:rPr>
-        <w:t xml:space="preserve">[Pendiente de redactar]</w:t>
+          <w:sz w:val="22"/>
+          <w:szCs w:val="22"/>
+        </w:rPr>
+        <w:t xml:space="preserve">El centro elegido para el desarrollo de esta programación didáctica es el IES Poeta Julián Andúgar, situado en el municipio de Santomera (Región de Murcia). Según su Proyecto Educativo de Centro (curso 2025-2026), se trata de un centro de titularidad pública con 60 años de experiencia, que recibe alumnado principalmente de las tres localidades que componen el municipio —Santomera, El Siscar y La Matanza—, así como de pedanías próximas (La Orilla del Azarbe, Cobatillas, El Esparragal) y, en menor medida, de otras zonas de la Región, sobre todo para las enseñanzas de Formación Profesional.</w:t>
+      </w:r>
+    </w:p>
+    <w:p>
+      <w:pPr>
+        <w:spacing w:after="240" w:line="240"/>
+      </w:pPr>
+      <w:r>
+        <w:rPr>
+          <w:rFonts w:ascii="Arial" w:cs="Arial" w:eastAsia="Arial" w:hAnsi="Arial"/>
+          <w:sz w:val="22"/>
+          <w:szCs w:val="22"/>
+        </w:rPr>
+        <w:t xml:space="preserve">El centro oferta todos los niveles de la Educación Secundaria Obligatoria y Bachillerato (en las modalidades de Ciencias y Tecnología y de Humanidades y Ciencias Sociales, con Bachillerato de Investigación en ambos cursos), además de Formación Profesional. Dentro de esta última, imparte Servicios Comerciales (Grado Básico) y Actividades Comerciales (Grado Medio), y ha ampliado su oferta de Grado Superior con los ciclos de Educación Infantil y de Integración Social —este último, de la familia profesional de Servicios Socioculturales y a la Comunidad, es en el que se enmarca el módulo 0017. Habilidades sociales objeto de esta programación.</w:t>
+      </w:r>
+    </w:p>
+    <w:p>
+      <w:pPr>
+        <w:spacing w:after="240" w:line="240"/>
+      </w:pPr>
+      <w:r>
+        <w:rPr>
+          <w:rFonts w:ascii="Arial" w:cs="Arial" w:eastAsia="Arial" w:hAnsi="Arial"/>
+          <w:sz w:val="22"/>
+          <w:szCs w:val="22"/>
+        </w:rPr>
+        <w:t xml:space="preserve">El número de alumnado matriculado en el centro supera los 1.000 estudiantes en el curso 2025-2026, aunque el Proyecto Educativo consultado no desglosa esta cifra por etapa o ciclo formativo, por lo que la </w:t>
+      </w:r>
+      <w:r>
+        <w:rPr>
+          <w:rFonts w:ascii="Arial" w:cs="Arial" w:eastAsia="Arial" w:hAnsi="Arial"/>
+          <w:b/>
+          <w:bCs/>
+          <w:color w:val="C00000"/>
+          <w:sz w:val="22"/>
+          <w:szCs w:val="22"/>
+        </w:rPr>
+        <w:t xml:space="preserve">ratio concreta del grupo de Integración Social queda pendiente de confirmar [dato no publicado en el PEC ni en la PGA del centro]</w:t>
+      </w:r>
+      <w:r>
+        <w:rPr>
+          <w:rFonts w:ascii="Arial" w:cs="Arial" w:eastAsia="Arial" w:hAnsi="Arial"/>
+          <w:sz w:val="22"/>
+          <w:szCs w:val="22"/>
+        </w:rPr>
+        <w:t xml:space="preserve">.</w:t>
+      </w:r>
+    </w:p>
+    <w:p>
+      <w:pPr>
+        <w:spacing w:after="240" w:line="240"/>
+      </w:pPr>
+      <w:r>
+        <w:rPr>
+          <w:rFonts w:ascii="Arial" w:cs="Arial" w:eastAsia="Arial" w:hAnsi="Arial"/>
+          <w:sz w:val="22"/>
+          <w:szCs w:val="22"/>
+        </w:rPr>
+        <w:t xml:space="preserve">Respecto a la plantilla docente, según la Orden de 3 de marzo de 2026, de la Consejería de Educación y Formación Profesional de la Región de Murcia, por la que se publican la plantilla orgánica y las vacantes provisionales del concurso de traslados (BORM nº 54, de 6 de marzo de 2026), el centro cuenta con 77 puestos docentes ordinarios en total, repartidos entre 28 especialidades, entre las que figura 1 puesto de la especialidad «Servicios a la Comunidad» (código 0590225) —especialidad distinta de «Intervención Sociocomunitaria» dentro del mismo Cuerpo de Profesores de Enseñanza Secundaria—, sin que aparezca ningún puesto bajo esta última denominación. No obstante, de forma directa y no documental, se confirma la presencia en el centro de profesorado de la especialidad de Intervención Sociocomunitaria, tanto funcionariado de carrera como personal interino, si bien </w:t>
+      </w:r>
+      <w:r>
+        <w:rPr>
+          <w:rFonts w:ascii="Arial" w:cs="Arial" w:eastAsia="Arial" w:hAnsi="Arial"/>
+          <w:b/>
+          <w:bCs/>
+          <w:color w:val="C00000"/>
+          <w:sz w:val="22"/>
+          <w:szCs w:val="22"/>
+        </w:rPr>
+        <w:t xml:space="preserve">no ha sido posible determinar su número exacto ni el de profesores del departamento de Servicios Socioculturales y a la Comunidad a través de fuentes documentales públicas</w:t>
+      </w:r>
+      <w:r>
+        <w:rPr>
+          <w:rFonts w:ascii="Arial" w:cs="Arial" w:eastAsia="Arial" w:hAnsi="Arial"/>
+          <w:sz w:val="22"/>
+          <w:szCs w:val="22"/>
+        </w:rPr>
+        <w:t xml:space="preserve">.</w:t>
+      </w:r>
+    </w:p>
+    <w:p>
+      <w:pPr>
+        <w:spacing w:after="240" w:line="240"/>
+      </w:pPr>
+      <w:r>
+        <w:rPr>
+          <w:rFonts w:ascii="Arial" w:cs="Arial" w:eastAsia="Arial" w:hAnsi="Arial"/>
+          <w:sz w:val="22"/>
+          <w:szCs w:val="22"/>
+        </w:rPr>
+        <w:t xml:space="preserve">Según la información publicada en la web oficial del centro (no recogida en el Proyecto Educativo consultado), el IES Poeta Julián Andúgar cuenta con la Carta Erasmus de Educación Superior (ECHE) 2021-2027 y desarrolla un proyecto Erasmus+ KA131 dirigido específicamente a la movilidad de estudiantes y profesorado de los Ciclos Formativos de Grado Superior —entre los que se encuentra el de Integración Social—, con destinos como Irlanda, Italia o Noruega.</w:t>
+      </w:r>
+    </w:p>
+    <w:p>
+      <w:pPr>
+        <w:spacing w:after="240" w:line="240"/>
+      </w:pPr>
+      <w:r>
+        <w:rPr>
+          <w:rFonts w:ascii="Arial" w:cs="Arial" w:eastAsia="Arial" w:hAnsi="Arial"/>
+          <w:b/>
+          <w:bCs/>
+          <w:color w:val="C00000"/>
+          <w:sz w:val="22"/>
+          <w:szCs w:val="22"/>
+        </w:rPr>
+        <w:t xml:space="preserve">En cuanto a las instalaciones y recursos materiales de los que dispone el centro para el desarrollo del módulo, ni el Proyecto Educativo ni la Programación General Anual consultados detallan un inventario de espacios o equipamiento específico, por lo que este punto queda pendiente de concretar con información más directa del centro.</w:t>
       </w:r>
     </w:p>
     <w:p>

</xml_diff>

<commit_message>
Corregir CINE-5b por CINE-P-5.5.4 en el punto 1.1
El RD 1074/2012, articulo 2 (redactado por el RD 289/2023), identifica
el titulo con la referencia CINE-P-5.5.4, no CINE-5b como se habia
puesto inicialmente siguiendo el ejemplo de la guia de la preparadora.
Verificado visualmente contra el PDF original del BOE (RD 289/2023,
pagina 60052).

Co-Authored-By: Claude Sonnet 5 <noreply@anthropic.com>
Claude-Session: https://claude.ai/code/session_018x8SAWzLDt9GJuoqda3PdZ
</commit_message>
<xml_diff>
--- a/preparacion-oposicion-2027/materiales/Plantilla_Entrega2_0017_Habilidades_Sociales.docx
+++ b/preparacion-oposicion-2027/materiales/Plantilla_Entrega2_0017_Habilidades_Sociales.docx
@@ -552,7 +552,7 @@
                 <w:sz w:val="20"/>
                 <w:szCs w:val="20"/>
               </w:rPr>
-              <w:t xml:space="preserve">CINE-5b.</w:t>
+              <w:t xml:space="preserve">CINE-P-5.5.4.</w:t>
             </w:r>
           </w:p>
         </w:tc>
@@ -677,7 +677,7 @@
           <w:sz w:val="22"/>
           <w:szCs w:val="22"/>
         </w:rPr>
-        <w:t xml:space="preserve">Esta programación didáctica se desarrolla a partir del módulo profesional 0017. Habilidades sociales, perteneciente al título de Técnico Superior en Integración Social —ciclo formativo de grado superior de la familia profesional de Servicios Socioculturales y a la Comunidad, con una duración total de 2.000 horas, referente CINE-5b y Nivel 1 del Marco Español de Cualificaciones para la Educación Superior (MECES)—, el cual queda identificado por los siguientes elementos:</w:t>
+        <w:t xml:space="preserve">Esta programación didáctica se desarrolla a partir del módulo profesional 0017. Habilidades sociales, perteneciente al título de Técnico Superior en Integración Social —ciclo formativo de grado superior de la familia profesional de Servicios Socioculturales y a la Comunidad, con una duración total de 2.000 horas, referente CINE-P-5.5.4 y Nivel 1 del Marco Español de Cualificaciones para la Educación Superior (MECES)—, el cual queda identificado por los siguientes elementos:</w:t>
       </w:r>
     </w:p>
     <w:tbl>

</xml_diff>

<commit_message>
Retirar del 2.1 las cifras de plantilla no confirmadas (BORM)
Pepe confirma con su excompañero (docente de IS en el IES Villa de
Abaran) que las cifras de la plantilla organica del concurso de
traslados (1 puesto de Intervencion Sociocomunitaria + 2 de Servicios a
la Comunidad) no son oficiales ni reales. Se retiran del 2.1 y el
numero de docentes del departamento queda completamente pendiente, sin
cifra de referencia, hasta que se confirme con una fuente fiable. Se
mantiene el dato de personal total del centro (99 docentes + 12 no
docentes), que no ha sido cuestionado.

Co-Authored-By: Claude Sonnet 5 <noreply@anthropic.com>
Claude-Session: https://claude.ai/code/session_018x8SAWzLDt9GJuoqda3PdZ
</commit_message>
<xml_diff>
--- a/preparacion-oposicion-2027/materiales/Plantilla_Entrega2_0017_Habilidades_Sociales.docx
+++ b/preparacion-oposicion-2027/materiales/Plantilla_Entrega2_0017_Habilidades_Sociales.docx
@@ -1861,7 +1861,7 @@
           <w:sz w:val="22"/>
           <w:szCs w:val="22"/>
         </w:rPr>
-        <w:t xml:space="preserve">El personal del centro está formado por 99 docentes (12 de ellos a tiempo parcial) y 12 no docentes (ordenanzas, personal de limpieza, personal administrativo, un Auxiliar Técnico Educativo y un mediador comunicativo). Según la Orden de 3 de marzo de 2026, de la Consejería de Educación y Formación Profesional de la Región de Murcia, por la que se publican la plantilla orgánica y las vacantes provisionales del concurso de traslados (BORM nº 54, de 6 de marzo de 2026), la plantilla orgánica oficial del centro recoge 69 puestos docentes ordinarios en 25 especialidades, entre las que figuran 1 puesto de «Intervención Sociocomunitaria» (código 0590108) y 2 puestos de «Servicios a la Comunidad» (código 0590225). </w:t>
+        <w:t xml:space="preserve">El personal del centro está formado por 99 docentes (12 de ellos a tiempo parcial) y 12 no docentes (ordenanzas, personal de limpieza, personal administrativo, un Auxiliar Técnico Educativo y un mediador comunicativo), según la Programación General Anual del curso 2025-2026. </w:t>
       </w:r>
       <w:r>
         <w:rPr>
@@ -1872,7 +1872,7 @@
           <w:sz w:val="22"/>
           <w:szCs w:val="22"/>
         </w:rPr>
-        <w:t xml:space="preserve">Esta cifra corresponde a la plantilla orgánica del concurso de traslados y puede no reflejar el número total de docentes del departamento en el presente curso, incluyendo personal interino, ni el porcentaje de profesorado definitivo frente a interino; esta información se ha solicitado a un contacto directo del centro y se incorporará en cuanto se confirme</w:t>
+        <w:t xml:space="preserve">El número de docentes del departamento de Servicios Socioculturales y a la Comunidad en este centro (especialidades de Intervención Sociocomunitaria y de Servicios a la Comunidad), así como el porcentaje de profesorado con destino definitivo frente a interino, no ha podido confirmarse todavía con una fuente fiable; esta información se ha solicitado a un contacto directo del centro y se incorporará en cuanto se confirme</w:t>
       </w:r>
       <w:r>
         <w:rPr>

</xml_diff>

<commit_message>
Cerrar el punto 3 completo (3.1-3.3) de la segunda entrega
Redacta Competencia general, Competencias profesionales y para la
empleabilidad, y Cualificaciones profesionales y unidades de
competencia, verificando cada articulo directamente en el BOE (RD
1074/2012, RD 289/2023, RD 659/2023) en lugar de copiar los ejemplos de
la guia de la preparadora, que en el caso de la competencia general
estan desactualizados (texto anterior a la reforma de 2023).

Co-Authored-By: Claude Sonnet 5 <noreply@anthropic.com>
Claude-Session: https://claude.ai/code/session_018x8SAWzLDt9GJuoqda3PdZ
</commit_message>
<xml_diff>
--- a/preparacion-oposicion-2027/materiales/Plantilla_Entrega2_0017_Habilidades_Sociales.docx
+++ b/preparacion-oposicion-2027/materiales/Plantilla_Entrega2_0017_Habilidades_Sociales.docx
@@ -2077,13 +2077,26 @@
       <w:r>
         <w:rPr>
           <w:rFonts w:ascii="Arial" w:cs="Arial" w:eastAsia="Arial" w:hAnsi="Arial"/>
+          <w:sz w:val="22"/>
+          <w:szCs w:val="22"/>
+        </w:rPr>
+        <w:t xml:space="preserve">La competencia general describe las funciones profesionales más significativas del perfil profesional del título. Constituye el referente último y común a todos los módulos que integran el ciclo, y se encuentra siempre en el Real Decreto que fija las enseñanzas mínimas del título —nunca en el decreto u orden que lo desarrolla en cada comunidad autónoma—, conforme a lo establecido en el artículo 83.b) del Real Decreto 659/2023, de 18 de julio, que incluye la competencia general dentro de los elementos mínimos del «perfil profesional» de todo título de Formación Profesional.</w:t>
+      </w:r>
+    </w:p>
+    <w:p>
+      <w:pPr>
+        <w:ind w:left="567" w:right="567"/>
+        <w:spacing w:after="240" w:line="240"/>
+      </w:pPr>
+      <w:r>
+        <w:rPr>
+          <w:rFonts w:ascii="Arial" w:cs="Arial" w:eastAsia="Arial" w:hAnsi="Arial"/>
           <w:i/>
           <w:iCs/>
-          <w:color w:val="808080"/>
-          <w:sz w:val="22"/>
-          <w:szCs w:val="22"/>
-        </w:rPr>
-        <w:t xml:space="preserve">[Pendiente de redactar]</w:t>
+          <w:sz w:val="22"/>
+          <w:szCs w:val="22"/>
+        </w:rPr>
+        <w:t xml:space="preserve">«La competencia general de este título consiste en programar, organizar y evaluar las intervenciones de integración social aplicando estrategias y técnicas específicas, promoviendo la equidad, igualdad de oportunidades e inclusión, actuando en todo momento con una actitud de respeto hacia las personas destinatarias y garantizando la creación de entornos seguros tanto para las personas destinatarias como para el profesional, con el fin de mejorar su situación personal, familiar y/o social» (art. 4 del Real Decreto 1074/2012, de 13 de julio, en su redacción dada por el artículo segundo, apartado Dos, del Real Decreto 289/2023, de 18 de abril).</w:t>
       </w:r>
     </w:p>
     <w:p>
@@ -2109,45 +2122,680 @@
       <w:r>
         <w:rPr>
           <w:rFonts w:ascii="Arial" w:cs="Arial" w:eastAsia="Arial" w:hAnsi="Arial"/>
+          <w:sz w:val="22"/>
+          <w:szCs w:val="22"/>
+        </w:rPr>
+        <w:t xml:space="preserve">Las competencias profesionales y para la empleabilidad —denominación que, desde el Real Decreto 659/2023, sustituye a la anterior «competencias profesionales, personales y sociales»— forman, junto con la competencia general, el «perfil profesional» del título (art. 83.b) del Real Decreto 659/2023). Al igual que la competencia general, esta relación completa de competencias se recoge siempre en el Real Decreto que fija las enseñanzas mínimas del título, en este caso en el artículo 5 del Real Decreto 1074/2012 —no modificado por el Real Decreto 289/2023—, que relaciona un total de veintitrés competencias (letras a a la w).</w:t>
+      </w:r>
+    </w:p>
+    <w:p>
+      <w:pPr>
+        <w:spacing w:after="240" w:line="240"/>
+      </w:pPr>
+      <w:r>
+        <w:rPr>
+          <w:rFonts w:ascii="Arial" w:cs="Arial" w:eastAsia="Arial" w:hAnsi="Arial"/>
+          <w:sz w:val="22"/>
+          <w:szCs w:val="22"/>
+        </w:rPr>
+        <w:t xml:space="preserve">De estas veintitrés, el propio Real Decreto 1074/2012 —en la redacción del módulo profesional 0017. Habilidades sociales dada por el Real Decreto 289/2023, dentro de sus orientaciones pedagógicas— indica expresamente que este módulo contribuye a alcanzar las competencias profesionales y para la empleabilidad m), o), q), r), s) y u) del título, que se relacionan a continuación:</w:t>
+      </w:r>
+    </w:p>
+    <w:p>
+      <w:pPr>
+        <w:ind w:left="284"/>
+        <w:spacing w:after="240" w:line="240"/>
+      </w:pPr>
+      <w:r>
+        <w:rPr>
+          <w:rFonts w:ascii="Arial" w:cs="Arial" w:eastAsia="Arial" w:hAnsi="Arial"/>
+          <w:b/>
+          <w:bCs/>
+          <w:sz w:val="22"/>
+          <w:szCs w:val="22"/>
+        </w:rPr>
+        <w:t xml:space="preserve">m) </w:t>
+      </w:r>
+      <w:r>
+        <w:rPr>
+          <w:rFonts w:ascii="Arial" w:cs="Arial" w:eastAsia="Arial" w:hAnsi="Arial"/>
+          <w:sz w:val="22"/>
+          <w:szCs w:val="22"/>
+        </w:rPr>
+        <w:t xml:space="preserve">Realizar tareas de mediación entre personas y grupos, aplicando técnicas participativas y de gestión de conflictos de forma eficiente.</w:t>
+      </w:r>
+    </w:p>
+    <w:p>
+      <w:pPr>
+        <w:ind w:left="284"/>
+        <w:spacing w:after="240" w:line="240"/>
+      </w:pPr>
+      <w:r>
+        <w:rPr>
+          <w:rFonts w:ascii="Arial" w:cs="Arial" w:eastAsia="Arial" w:hAnsi="Arial"/>
+          <w:b/>
+          <w:bCs/>
+          <w:sz w:val="22"/>
+          <w:szCs w:val="22"/>
+        </w:rPr>
+        <w:t xml:space="preserve">o) </w:t>
+      </w:r>
+      <w:r>
+        <w:rPr>
+          <w:rFonts w:ascii="Arial" w:cs="Arial" w:eastAsia="Arial" w:hAnsi="Arial"/>
+          <w:sz w:val="22"/>
+          <w:szCs w:val="22"/>
+        </w:rPr>
+        <w:t xml:space="preserve">Mantener relaciones fluidas con las personas usuarias y sus familias, miembros del grupo de trabajo y otros profesionales, mostrando habilidades sociales y aportando soluciones a los conflictos que surjan.</w:t>
+      </w:r>
+    </w:p>
+    <w:p>
+      <w:pPr>
+        <w:ind w:left="284"/>
+        <w:spacing w:after="240" w:line="240"/>
+      </w:pPr>
+      <w:r>
+        <w:rPr>
+          <w:rFonts w:ascii="Arial" w:cs="Arial" w:eastAsia="Arial" w:hAnsi="Arial"/>
+          <w:b/>
+          <w:bCs/>
+          <w:sz w:val="22"/>
+          <w:szCs w:val="22"/>
+        </w:rPr>
+        <w:t xml:space="preserve">q) </w:t>
+      </w:r>
+      <w:r>
+        <w:rPr>
+          <w:rFonts w:ascii="Arial" w:cs="Arial" w:eastAsia="Arial" w:hAnsi="Arial"/>
+          <w:sz w:val="22"/>
+          <w:szCs w:val="22"/>
+        </w:rPr>
+        <w:t xml:space="preserve">Resolver situaciones, problemas o contingencias con iniciativa y autonomía en el ámbito de su competencia, con creatividad, innovación y espíritu de mejora en el trabajo personal y en el de los miembros del equipo.</w:t>
+      </w:r>
+    </w:p>
+    <w:p>
+      <w:pPr>
+        <w:ind w:left="284"/>
+        <w:spacing w:after="240" w:line="240"/>
+      </w:pPr>
+      <w:r>
+        <w:rPr>
+          <w:rFonts w:ascii="Arial" w:cs="Arial" w:eastAsia="Arial" w:hAnsi="Arial"/>
+          <w:b/>
+          <w:bCs/>
+          <w:sz w:val="22"/>
+          <w:szCs w:val="22"/>
+        </w:rPr>
+        <w:t xml:space="preserve">r) </w:t>
+      </w:r>
+      <w:r>
+        <w:rPr>
+          <w:rFonts w:ascii="Arial" w:cs="Arial" w:eastAsia="Arial" w:hAnsi="Arial"/>
+          <w:sz w:val="22"/>
+          <w:szCs w:val="22"/>
+        </w:rPr>
+        <w:t xml:space="preserve">Organizar y coordinar equipos de trabajo con responsabilidad, supervisando el desarrollo del mismo, manteniendo relaciones fluidas y asumiendo el liderazgo, así como aportando soluciones a los conflictos grupales que se presenten.</w:t>
+      </w:r>
+    </w:p>
+    <w:p>
+      <w:pPr>
+        <w:ind w:left="284"/>
+        <w:spacing w:after="240" w:line="240"/>
+      </w:pPr>
+      <w:r>
+        <w:rPr>
+          <w:rFonts w:ascii="Arial" w:cs="Arial" w:eastAsia="Arial" w:hAnsi="Arial"/>
+          <w:b/>
+          <w:bCs/>
+          <w:sz w:val="22"/>
+          <w:szCs w:val="22"/>
+        </w:rPr>
+        <w:t xml:space="preserve">s) </w:t>
+      </w:r>
+      <w:r>
+        <w:rPr>
+          <w:rFonts w:ascii="Arial" w:cs="Arial" w:eastAsia="Arial" w:hAnsi="Arial"/>
+          <w:sz w:val="22"/>
+          <w:szCs w:val="22"/>
+        </w:rPr>
+        <w:t xml:space="preserve">Comunicarse con sus iguales, superiores, clientes y personas bajo su responsabilidad, utilizando vías eficaces de comunicación, transmitiendo la información o conocimientos adecuados y respetando la autonomía y competencia de las personas que intervienen en el ámbito de su trabajo.</w:t>
+      </w:r>
+    </w:p>
+    <w:p>
+      <w:pPr>
+        <w:ind w:left="284"/>
+        <w:spacing w:after="240" w:line="240"/>
+      </w:pPr>
+      <w:r>
+        <w:rPr>
+          <w:rFonts w:ascii="Arial" w:cs="Arial" w:eastAsia="Arial" w:hAnsi="Arial"/>
+          <w:b/>
+          <w:bCs/>
+          <w:sz w:val="22"/>
+          <w:szCs w:val="22"/>
+        </w:rPr>
+        <w:t xml:space="preserve">u) </w:t>
+      </w:r>
+      <w:r>
+        <w:rPr>
+          <w:rFonts w:ascii="Arial" w:cs="Arial" w:eastAsia="Arial" w:hAnsi="Arial"/>
+          <w:sz w:val="22"/>
+          <w:szCs w:val="22"/>
+        </w:rPr>
+        <w:t xml:space="preserve">Supervisar y aplicar procedimientos de gestión de calidad, de accesibilidad universal y de «diseño para todos», en las actividades profesionales incluidas en los procesos de producción o prestación de servicios.</w:t>
+      </w:r>
+    </w:p>
+    <w:p>
+      <w:pPr>
+        <w:pStyle w:val="Heading2"/>
+        <w:spacing w:after="120" w:before="200" w:line="240"/>
+      </w:pPr>
+      <w:r>
+        <w:rPr>
+          <w:rFonts w:ascii="Arial" w:cs="Arial" w:eastAsia="Arial" w:hAnsi="Arial"/>
+          <w:b/>
+          <w:bCs/>
+          <w:sz w:val="24"/>
+          <w:szCs w:val="24"/>
+        </w:rPr>
+        <w:t xml:space="preserve">3.3 Cualificaciones profesionales y unidades de competencia</w:t>
+      </w:r>
+    </w:p>
+    <w:p>
+      <w:pPr>
+        <w:spacing w:after="240" w:line="240"/>
+      </w:pPr>
+      <w:r>
+        <w:rPr>
+          <w:rFonts w:ascii="Arial" w:cs="Arial" w:eastAsia="Arial" w:hAnsi="Arial"/>
+          <w:sz w:val="22"/>
+          <w:szCs w:val="22"/>
+        </w:rPr>
+        <w:t xml:space="preserve">Las cualificaciones profesionales y las unidades de competencia son dos elementos asociados a las competencias de cada título, referidos a la titulación y acreditación de los profesionales, no directamente al currículo de las enseñanzas. Ambas quedan establecidas por el Catálogo Nacional de Cualificaciones Profesionales y se recogen, al igual que en los dos apartados anteriores, en el Real Decreto que fija las enseñanzas mínimas del título —en este caso, en el artículo 6 del Real Decreto 1074/2012, en su redacción dada por el artículo segundo, apartado Tres, del Real Decreto 289/2023, de 18 de abril.</w:t>
+      </w:r>
+    </w:p>
+    <w:p>
+      <w:pPr>
+        <w:spacing w:after="120" w:before="120" w:line="240"/>
+      </w:pPr>
+      <w:r>
+        <w:rPr>
+          <w:rFonts w:ascii="Arial" w:cs="Arial" w:eastAsia="Arial" w:hAnsi="Arial"/>
+          <w:b/>
+          <w:bCs/>
           <w:i/>
           <w:iCs/>
-          <w:color w:val="808080"/>
-          <w:sz w:val="22"/>
-          <w:szCs w:val="22"/>
-        </w:rPr>
-        <w:t xml:space="preserve">[Pendiente de redactar]</w:t>
-      </w:r>
-    </w:p>
-    <w:p>
-      <w:pPr>
-        <w:pStyle w:val="Heading2"/>
-        <w:spacing w:after="120" w:before="200" w:line="240"/>
-      </w:pPr>
-      <w:r>
-        <w:rPr>
-          <w:rFonts w:ascii="Arial" w:cs="Arial" w:eastAsia="Arial" w:hAnsi="Arial"/>
-          <w:b/>
-          <w:bCs/>
-          <w:sz w:val="24"/>
-          <w:szCs w:val="24"/>
-        </w:rPr>
-        <w:t xml:space="preserve">3.3 Cualificaciones profesionales y unidades de competencia</w:t>
-      </w:r>
-    </w:p>
-    <w:p>
-      <w:pPr>
-        <w:spacing w:after="240" w:line="240"/>
-      </w:pPr>
+          <w:sz w:val="22"/>
+          <w:szCs w:val="22"/>
+        </w:rPr>
+        <w:t xml:space="preserve">Cualificaciones profesionales completas</w:t>
+      </w:r>
+    </w:p>
+    <w:p>
+      <w:pPr>
+        <w:ind w:left="284"/>
+        <w:spacing w:after="240" w:line="240"/>
+      </w:pPr>
+      <w:r>
+        <w:rPr>
+          <w:rFonts w:ascii="Arial" w:cs="Arial" w:eastAsia="Arial" w:hAnsi="Arial"/>
+          <w:b/>
+          <w:bCs/>
+          <w:sz w:val="22"/>
+          <w:szCs w:val="22"/>
+        </w:rPr>
+        <w:t xml:space="preserve">a) Educación de habilidades de autonomía personal y social SSC090_3 </w:t>
+      </w:r>
       <w:r>
         <w:rPr>
           <w:rFonts w:ascii="Arial" w:cs="Arial" w:eastAsia="Arial" w:hAnsi="Arial"/>
           <w:i/>
           <w:iCs/>
-          <w:color w:val="808080"/>
-          <w:sz w:val="22"/>
-          <w:szCs w:val="22"/>
-        </w:rPr>
-        <w:t xml:space="preserve">[Pendiente de redactar]</w:t>
+          <w:sz w:val="22"/>
+          <w:szCs w:val="22"/>
+        </w:rPr>
+        <w:t xml:space="preserve">(Real Decreto 295/2004, de 20 de febrero).</w:t>
+      </w:r>
+    </w:p>
+    <w:p>
+      <w:pPr>
+        <w:ind w:left="568"/>
+        <w:spacing w:after="240" w:line="240"/>
+      </w:pPr>
+      <w:r>
+        <w:rPr>
+          <w:rFonts w:ascii="Arial" w:cs="Arial" w:eastAsia="Arial" w:hAnsi="Arial"/>
+          <w:sz w:val="22"/>
+          <w:szCs w:val="22"/>
+        </w:rPr>
+        <w:t xml:space="preserve">UC0252_3: Programar, organizar y evaluar las intervenciones de integración social.</w:t>
+      </w:r>
+    </w:p>
+    <w:p>
+      <w:pPr>
+        <w:ind w:left="568"/>
+        <w:spacing w:after="240" w:line="240"/>
+      </w:pPr>
+      <w:r>
+        <w:rPr>
+          <w:rFonts w:ascii="Arial" w:cs="Arial" w:eastAsia="Arial" w:hAnsi="Arial"/>
+          <w:sz w:val="22"/>
+          <w:szCs w:val="22"/>
+        </w:rPr>
+        <w:t xml:space="preserve">UC0253_3: Desarrollar las intervenciones dirigidas al entrenamiento y a la adquisición de habilidades de autonomía personal y social.</w:t>
+      </w:r>
+    </w:p>
+    <w:p>
+      <w:pPr>
+        <w:ind w:left="568"/>
+        <w:spacing w:after="240" w:line="240"/>
+      </w:pPr>
+      <w:r>
+        <w:rPr>
+          <w:rFonts w:ascii="Arial" w:cs="Arial" w:eastAsia="Arial" w:hAnsi="Arial"/>
+          <w:sz w:val="22"/>
+          <w:szCs w:val="22"/>
+        </w:rPr>
+        <w:t xml:space="preserve">UC0254_3: Establecer, adaptar y aplicar sistemas alternativos de comunicación.</w:t>
+      </w:r>
+    </w:p>
+    <w:p>
+      <w:pPr>
+        <w:ind w:left="284"/>
+        <w:spacing w:after="240" w:line="240"/>
+      </w:pPr>
+      <w:r>
+        <w:rPr>
+          <w:rFonts w:ascii="Arial" w:cs="Arial" w:eastAsia="Arial" w:hAnsi="Arial"/>
+          <w:b/>
+          <w:bCs/>
+          <w:sz w:val="22"/>
+          <w:szCs w:val="22"/>
+        </w:rPr>
+        <w:t xml:space="preserve">b) Mediación comunitaria SSC324_3 </w:t>
+      </w:r>
+      <w:r>
+        <w:rPr>
+          <w:rFonts w:ascii="Arial" w:cs="Arial" w:eastAsia="Arial" w:hAnsi="Arial"/>
+          <w:i/>
+          <w:iCs/>
+          <w:sz w:val="22"/>
+          <w:szCs w:val="22"/>
+        </w:rPr>
+        <w:t xml:space="preserve">(Real Decreto 1368/2007, de 19 de octubre, actualizada por Orden PRE/2053/2015, de 1 de octubre).</w:t>
+      </w:r>
+    </w:p>
+    <w:p>
+      <w:pPr>
+        <w:ind w:left="568"/>
+        <w:spacing w:after="240" w:line="240"/>
+      </w:pPr>
+      <w:r>
+        <w:rPr>
+          <w:rFonts w:ascii="Arial" w:cs="Arial" w:eastAsia="Arial" w:hAnsi="Arial"/>
+          <w:sz w:val="22"/>
+          <w:szCs w:val="22"/>
+        </w:rPr>
+        <w:t xml:space="preserve">UC1038_3: Identificar y concretar las características y necesidades del contexto social de la intervención.</w:t>
+      </w:r>
+    </w:p>
+    <w:p>
+      <w:pPr>
+        <w:ind w:left="568"/>
+        <w:spacing w:after="240" w:line="240"/>
+      </w:pPr>
+      <w:r>
+        <w:rPr>
+          <w:rFonts w:ascii="Arial" w:cs="Arial" w:eastAsia="Arial" w:hAnsi="Arial"/>
+          <w:sz w:val="22"/>
+          <w:szCs w:val="22"/>
+        </w:rPr>
+        <w:t xml:space="preserve">UC1039_3: Prevenir conflictos entre distintas personas, actores y colectivos sociales.</w:t>
+      </w:r>
+    </w:p>
+    <w:p>
+      <w:pPr>
+        <w:ind w:left="568"/>
+        <w:spacing w:after="240" w:line="240"/>
+      </w:pPr>
+      <w:r>
+        <w:rPr>
+          <w:rFonts w:ascii="Arial" w:cs="Arial" w:eastAsia="Arial" w:hAnsi="Arial"/>
+          <w:sz w:val="22"/>
+          <w:szCs w:val="22"/>
+        </w:rPr>
+        <w:t xml:space="preserve">UC1040_3: Organizar e implementar el proceso de gestión de conflictos.</w:t>
+      </w:r>
+    </w:p>
+    <w:p>
+      <w:pPr>
+        <w:ind w:left="568"/>
+        <w:spacing w:after="240" w:line="240"/>
+      </w:pPr>
+      <w:r>
+        <w:rPr>
+          <w:rFonts w:ascii="Arial" w:cs="Arial" w:eastAsia="Arial" w:hAnsi="Arial"/>
+          <w:sz w:val="22"/>
+          <w:szCs w:val="22"/>
+        </w:rPr>
+        <w:t xml:space="preserve">UC1041_3: Realizar la valoración, el seguimiento y la difusión de la mediación como una vía de gestión de conflictos.</w:t>
+      </w:r>
+    </w:p>
+    <w:p>
+      <w:pPr>
+        <w:ind w:left="568"/>
+        <w:spacing w:after="240" w:line="240"/>
+      </w:pPr>
+      <w:r>
+        <w:rPr>
+          <w:rFonts w:ascii="Arial" w:cs="Arial" w:eastAsia="Arial" w:hAnsi="Arial"/>
+          <w:sz w:val="22"/>
+          <w:szCs w:val="22"/>
+        </w:rPr>
+        <w:t xml:space="preserve">UC1026_3: Incorporar la perspectiva de género en los proyectos de intervención social.</w:t>
+      </w:r>
+    </w:p>
+    <w:p>
+      <w:pPr>
+        <w:ind w:left="284"/>
+        <w:spacing w:after="240" w:line="240"/>
+      </w:pPr>
+      <w:r>
+        <w:rPr>
+          <w:rFonts w:ascii="Arial" w:cs="Arial" w:eastAsia="Arial" w:hAnsi="Arial"/>
+          <w:b/>
+          <w:bCs/>
+          <w:sz w:val="22"/>
+          <w:szCs w:val="22"/>
+        </w:rPr>
+        <w:t xml:space="preserve">c) Inserción laboral de personas con discapacidad SSC323_3 </w:t>
+      </w:r>
+      <w:r>
+        <w:rPr>
+          <w:rFonts w:ascii="Arial" w:cs="Arial" w:eastAsia="Arial" w:hAnsi="Arial"/>
+          <w:i/>
+          <w:iCs/>
+          <w:sz w:val="22"/>
+          <w:szCs w:val="22"/>
+        </w:rPr>
+        <w:t xml:space="preserve">(Real Decreto 1368/2007, de 19 de octubre, actualizada por Orden PRE/2053/2015, de 1 de octubre).</w:t>
+      </w:r>
+    </w:p>
+    <w:p>
+      <w:pPr>
+        <w:ind w:left="568"/>
+        <w:spacing w:after="240" w:line="240"/>
+      </w:pPr>
+      <w:r>
+        <w:rPr>
+          <w:rFonts w:ascii="Arial" w:cs="Arial" w:eastAsia="Arial" w:hAnsi="Arial"/>
+          <w:sz w:val="22"/>
+          <w:szCs w:val="22"/>
+        </w:rPr>
+        <w:t xml:space="preserve">UC1034_3: Gestionar la información sobre los recursos sociolaborales y formativos y colaborar en el análisis de puestos de trabajo para la inserción sociolaboral de personas con discapacidad.</w:t>
+      </w:r>
+    </w:p>
+    <w:p>
+      <w:pPr>
+        <w:ind w:left="568"/>
+        <w:spacing w:after="240" w:line="240"/>
+      </w:pPr>
+      <w:r>
+        <w:rPr>
+          <w:rFonts w:ascii="Arial" w:cs="Arial" w:eastAsia="Arial" w:hAnsi="Arial"/>
+          <w:sz w:val="22"/>
+          <w:szCs w:val="22"/>
+        </w:rPr>
+        <w:t xml:space="preserve">UC1035_3: Realizar las intervenciones dirigidas al entrenamiento para la adquisición y desarrollo de habilidades sociolaborales en las personas con discapacidad.</w:t>
+      </w:r>
+    </w:p>
+    <w:p>
+      <w:pPr>
+        <w:ind w:left="568"/>
+        <w:spacing w:after="240" w:line="240"/>
+      </w:pPr>
+      <w:r>
+        <w:rPr>
+          <w:rFonts w:ascii="Arial" w:cs="Arial" w:eastAsia="Arial" w:hAnsi="Arial"/>
+          <w:sz w:val="22"/>
+          <w:szCs w:val="22"/>
+        </w:rPr>
+        <w:t xml:space="preserve">UC1036_3: Apoyar en el proceso de inserción sociolaboral de personas con discapacidad.</w:t>
+      </w:r>
+    </w:p>
+    <w:p>
+      <w:pPr>
+        <w:ind w:left="568"/>
+        <w:spacing w:after="240" w:line="240"/>
+      </w:pPr>
+      <w:r>
+        <w:rPr>
+          <w:rFonts w:ascii="Arial" w:cs="Arial" w:eastAsia="Arial" w:hAnsi="Arial"/>
+          <w:sz w:val="22"/>
+          <w:szCs w:val="22"/>
+        </w:rPr>
+        <w:t xml:space="preserve">UC1037_3: Efectuar el seguimiento de la inserción sociolaboral con la empresa, el usuario y su entorno personal.</w:t>
+      </w:r>
+    </w:p>
+    <w:p>
+      <w:pPr>
+        <w:ind w:left="284"/>
+        <w:spacing w:after="240" w:line="240"/>
+      </w:pPr>
+      <w:r>
+        <w:rPr>
+          <w:rFonts w:ascii="Arial" w:cs="Arial" w:eastAsia="Arial" w:hAnsi="Arial"/>
+          <w:b/>
+          <w:bCs/>
+          <w:sz w:val="22"/>
+          <w:szCs w:val="22"/>
+        </w:rPr>
+        <w:t xml:space="preserve">d) Promoción e intervención socioeducativa con personas con discapacidad SSC450_3 </w:t>
+      </w:r>
+      <w:r>
+        <w:rPr>
+          <w:rFonts w:ascii="Arial" w:cs="Arial" w:eastAsia="Arial" w:hAnsi="Arial"/>
+          <w:i/>
+          <w:iCs/>
+          <w:sz w:val="22"/>
+          <w:szCs w:val="22"/>
+        </w:rPr>
+        <w:t xml:space="preserve">(Real Decreto 1096/2011, de 22 de julio).</w:t>
+      </w:r>
+    </w:p>
+    <w:p>
+      <w:pPr>
+        <w:ind w:left="568"/>
+        <w:spacing w:after="240" w:line="240"/>
+      </w:pPr>
+      <w:r>
+        <w:rPr>
+          <w:rFonts w:ascii="Arial" w:cs="Arial" w:eastAsia="Arial" w:hAnsi="Arial"/>
+          <w:sz w:val="22"/>
+          <w:szCs w:val="22"/>
+        </w:rPr>
+        <w:t xml:space="preserve">UC1448_3: Detectar, generar y utilizar recursos sociales y comunitarios para la realización de intervenciones socioeducativas con personas con discapacidad.</w:t>
+      </w:r>
+    </w:p>
+    <w:p>
+      <w:pPr>
+        <w:ind w:left="568"/>
+        <w:spacing w:after="240" w:line="240"/>
+      </w:pPr>
+      <w:r>
+        <w:rPr>
+          <w:rFonts w:ascii="Arial" w:cs="Arial" w:eastAsia="Arial" w:hAnsi="Arial"/>
+          <w:sz w:val="22"/>
+          <w:szCs w:val="22"/>
+        </w:rPr>
+        <w:t xml:space="preserve">UC1449_3: Organizar y realizar el acompañamiento de personas con discapacidad en la realización de actividades programadas.</w:t>
+      </w:r>
+    </w:p>
+    <w:p>
+      <w:pPr>
+        <w:ind w:left="568"/>
+        <w:spacing w:after="240" w:line="240"/>
+      </w:pPr>
+      <w:r>
+        <w:rPr>
+          <w:rFonts w:ascii="Arial" w:cs="Arial" w:eastAsia="Arial" w:hAnsi="Arial"/>
+          <w:sz w:val="22"/>
+          <w:szCs w:val="22"/>
+        </w:rPr>
+        <w:t xml:space="preserve">UC1450_3: Organizar, desarrollar y evaluar procesos de inclusión de personas con discapacidad en espacios de ocio y tiempo libre.</w:t>
+      </w:r>
+    </w:p>
+    <w:p>
+      <w:pPr>
+        <w:ind w:left="568"/>
+        <w:spacing w:after="240" w:line="240"/>
+      </w:pPr>
+      <w:r>
+        <w:rPr>
+          <w:rFonts w:ascii="Arial" w:cs="Arial" w:eastAsia="Arial" w:hAnsi="Arial"/>
+          <w:sz w:val="22"/>
+          <w:szCs w:val="22"/>
+        </w:rPr>
+        <w:t xml:space="preserve">UC1451_3: Organizar y desarrollar el entrenamiento en estrategias cognitivas básicas y alfabetización tecnológica para personas con discapacidad, en colaboración con profesionales de nivel superior.</w:t>
+      </w:r>
+    </w:p>
+    <w:p>
+      <w:pPr>
+        <w:ind w:left="568"/>
+        <w:spacing w:after="240" w:line="240"/>
+      </w:pPr>
+      <w:r>
+        <w:rPr>
+          <w:rFonts w:ascii="Arial" w:cs="Arial" w:eastAsia="Arial" w:hAnsi="Arial"/>
+          <w:sz w:val="22"/>
+          <w:szCs w:val="22"/>
+        </w:rPr>
+        <w:t xml:space="preserve">UC1452_3: Actuar, orientar y apoyar a las familias de personas con discapacidad, en colaboración con profesionales de nivel superior.</w:t>
+      </w:r>
+    </w:p>
+    <w:p>
+      <w:pPr>
+        <w:spacing w:after="120" w:before="120" w:line="240"/>
+      </w:pPr>
+      <w:r>
+        <w:rPr>
+          <w:rFonts w:ascii="Arial" w:cs="Arial" w:eastAsia="Arial" w:hAnsi="Arial"/>
+          <w:b/>
+          <w:bCs/>
+          <w:i/>
+          <w:iCs/>
+          <w:sz w:val="22"/>
+          <w:szCs w:val="22"/>
+        </w:rPr>
+        <w:t xml:space="preserve">Cualificaciones profesionales incompletas</w:t>
+      </w:r>
+    </w:p>
+    <w:p>
+      <w:pPr>
+        <w:ind w:left="284"/>
+        <w:spacing w:after="240" w:line="240"/>
+      </w:pPr>
+      <w:r>
+        <w:rPr>
+          <w:rFonts w:ascii="Arial" w:cs="Arial" w:eastAsia="Arial" w:hAnsi="Arial"/>
+          <w:b/>
+          <w:bCs/>
+          <w:sz w:val="22"/>
+          <w:szCs w:val="22"/>
+        </w:rPr>
+        <w:t xml:space="preserve">a) Atención al alumnado con necesidades educativas especiales (ACNEE) en centros educativos SSC444_3 </w:t>
+      </w:r>
+      <w:r>
+        <w:rPr>
+          <w:rFonts w:ascii="Arial" w:cs="Arial" w:eastAsia="Arial" w:hAnsi="Arial"/>
+          <w:i/>
+          <w:iCs/>
+          <w:sz w:val="22"/>
+          <w:szCs w:val="22"/>
+        </w:rPr>
+        <w:t xml:space="preserve">(Real Decreto 1096/2011, de 22 de julio).</w:t>
+      </w:r>
+    </w:p>
+    <w:p>
+      <w:pPr>
+        <w:ind w:left="568"/>
+        <w:spacing w:after="240" w:line="240"/>
+      </w:pPr>
+      <w:r>
+        <w:rPr>
+          <w:rFonts w:ascii="Arial" w:cs="Arial" w:eastAsia="Arial" w:hAnsi="Arial"/>
+          <w:sz w:val="22"/>
+          <w:szCs w:val="22"/>
+        </w:rPr>
+        <w:t xml:space="preserve">UC1427_3: Ejecutar, en colaboración con el tutor/a y/o con el equipo interdisciplinar del centro educativo, los programas educativos del alumnado con necesidades educativas especiales (ACNEE) en su aula de referencia.</w:t>
+      </w:r>
+    </w:p>
+    <w:p>
+      <w:pPr>
+        <w:ind w:left="568"/>
+        <w:spacing w:after="240" w:line="240"/>
+      </w:pPr>
+      <w:r>
+        <w:rPr>
+          <w:rFonts w:ascii="Arial" w:cs="Arial" w:eastAsia="Arial" w:hAnsi="Arial"/>
+          <w:sz w:val="22"/>
+          <w:szCs w:val="22"/>
+        </w:rPr>
+        <w:t xml:space="preserve">UC1428_3: Implementar los programas de autonomía e higiene personal en el aseo del alumnado con necesidades educativas especiales (ACNEE), participando con el equipo interdisciplinar del centro educativo.</w:t>
+      </w:r>
+    </w:p>
+    <w:p>
+      <w:pPr>
+        <w:ind w:left="284"/>
+        <w:spacing w:after="240" w:line="240"/>
+      </w:pPr>
+      <w:r>
+        <w:rPr>
+          <w:rFonts w:ascii="Arial" w:cs="Arial" w:eastAsia="Arial" w:hAnsi="Arial"/>
+          <w:b/>
+          <w:bCs/>
+          <w:sz w:val="22"/>
+          <w:szCs w:val="22"/>
+        </w:rPr>
+        <w:t xml:space="preserve">b) Dinamización comunitaria SSC321_3 </w:t>
+      </w:r>
+      <w:r>
+        <w:rPr>
+          <w:rFonts w:ascii="Arial" w:cs="Arial" w:eastAsia="Arial" w:hAnsi="Arial"/>
+          <w:i/>
+          <w:iCs/>
+          <w:sz w:val="22"/>
+          <w:szCs w:val="22"/>
+        </w:rPr>
+        <w:t xml:space="preserve">(Real Decreto 1368/2007, de 19 de octubre, actualizada por Orden PRE/2053/2015, de 1 de octubre).</w:t>
+      </w:r>
+    </w:p>
+    <w:p>
+      <w:pPr>
+        <w:ind w:left="568"/>
+        <w:spacing w:after="240" w:line="240"/>
+      </w:pPr>
+      <w:r>
+        <w:rPr>
+          <w:rFonts w:ascii="Arial" w:cs="Arial" w:eastAsia="Arial" w:hAnsi="Arial"/>
+          <w:sz w:val="22"/>
+          <w:szCs w:val="22"/>
+        </w:rPr>
+        <w:t xml:space="preserve">UC1022_3: Dinamizar la planificación, desarrollo y evaluación de intervenciones y proyectos comunitarios y de participación ciudadana que se desarrollen entre los diferentes agentes que configuran una comunidad o una zona territorial.</w:t>
+      </w:r>
+    </w:p>
+    <w:p>
+      <w:pPr>
+        <w:ind w:left="568"/>
+        <w:spacing w:after="240" w:line="240"/>
+      </w:pPr>
+      <w:r>
+        <w:rPr>
+          <w:rFonts w:ascii="Arial" w:cs="Arial" w:eastAsia="Arial" w:hAnsi="Arial"/>
+          <w:sz w:val="22"/>
+          <w:szCs w:val="22"/>
+        </w:rPr>
+        <w:t xml:space="preserve">UC1024_3: Establecer estrategias de comunicación y difusión de los diferentes proyectos y actuaciones comunitarias.</w:t>
       </w:r>
     </w:p>
     <w:sectPr>

</xml_diff>

<commit_message>
Cerrar el punto 2.3 y marcar el punto 3 como borrador pendiente de confirmar
Redacta el 2.3 (entorno productivo del ciclo) con entidades reales y
verificadas de Abaran: servicios publicos confirmados (Servicio de
Ayuda a Domicilio y Centro de Dia para discapacidad intelectual,
convenio con el IMAS) y entidades del tercer sector (Caritas, Cruz
Roja, ADFA, Hogar del Pensionista, Amas de Casa), seleccionadas por
Pepe tras revisar la investigacion. Se descartan dos entidades que no
se pudieron verificar o que no pertenecen al municipio.

Se marca el punto 3 (Perfil profesional y curricular) como borrador NO
cerrado: se redacto sin preguntar antes a Pepe, a diferencia del resto
de puntos, y quedan dos preguntas suyas sin responder (formato tabla en
el 3.2, e investigar si el modulo 0017 tiene una unidad de competencia
concreta asociada para el 3.3).

Co-Authored-By: Claude Sonnet 5 <noreply@anthropic.com>
Claude-Session: https://claude.ai/code/session_018x8SAWzLDt9GJuoqda3PdZ
</commit_message>
<xml_diff>
--- a/preparacion-oposicion-2027/materiales/Plantilla_Entrega2_0017_Habilidades_Sociales.docx
+++ b/preparacion-oposicion-2027/materiales/Plantilla_Entrega2_0017_Habilidades_Sociales.docx
@@ -2029,13 +2029,114 @@
       <w:r>
         <w:rPr>
           <w:rFonts w:ascii="Arial" w:cs="Arial" w:eastAsia="Arial" w:hAnsi="Arial"/>
-          <w:i/>
-          <w:iCs/>
-          <w:color w:val="808080"/>
-          <w:sz w:val="22"/>
-          <w:szCs w:val="22"/>
-        </w:rPr>
-        <w:t xml:space="preserve">[Pendiente de redactar]</w:t>
+          <w:sz w:val="22"/>
+          <w:szCs w:val="22"/>
+        </w:rPr>
+        <w:t xml:space="preserve">Conforme al artículo 7 del Real Decreto 659/2023, de 18 de julio, los módulos profesionales se desarrollan combinando la formación en el centro educativo con la formación en la empresa, lo que exige al centro mantener una relación activa con su entorno productivo. En este sentido, la Programación General Anual del IES Villa de Abarán recoge, entre sus líneas de actuación para Formación Profesional, el objetivo de «potenciar las relaciones con las empresas de la localidad», sin que se concreten entidades específicas vinculadas al ciclo de Integración Social.</w:t>
+      </w:r>
+    </w:p>
+    <w:p>
+      <w:pPr>
+        <w:spacing w:after="240" w:line="240"/>
+      </w:pPr>
+      <w:r>
+        <w:rPr>
+          <w:rFonts w:ascii="Arial" w:cs="Arial" w:eastAsia="Arial" w:hAnsi="Arial"/>
+          <w:sz w:val="22"/>
+          <w:szCs w:val="22"/>
+        </w:rPr>
+        <w:t xml:space="preserve">A nivel de comunidad, el municipio de Abarán cuenta con una red de servicios y entidades sociales reales y documentadas que constituyen un entorno productivo y asociativo especialmente pertinente para el perfil profesional del Técnico Superior en Integración Social, aunque no se trate de colaboradores confirmados del propio centro educativo, sino de recursos del territorio en los que dicho perfil tiene cabida.</w:t>
+      </w:r>
+    </w:p>
+    <w:p>
+      <w:pPr>
+        <w:spacing w:after="240" w:line="240"/>
+      </w:pPr>
+      <w:r>
+        <w:rPr>
+          <w:rFonts w:ascii="Arial" w:cs="Arial" w:eastAsia="Arial" w:hAnsi="Arial"/>
+          <w:b/>
+          <w:bCs/>
+          <w:sz w:val="22"/>
+          <w:szCs w:val="22"/>
+        </w:rPr>
+        <w:t xml:space="preserve">Servicios de responsabilidad pública ya confirmados: </w:t>
+      </w:r>
+      <w:r>
+        <w:rPr>
+          <w:rFonts w:ascii="Arial" w:cs="Arial" w:eastAsia="Arial" w:hAnsi="Arial"/>
+          <w:sz w:val="22"/>
+          <w:szCs w:val="22"/>
+        </w:rPr>
+        <w:t xml:space="preserve">el Ayuntamiento de Abarán mantiene, mediante convenio con el Instituto Murciano de Acción Social (IMAS), el Servicio de Ayuda a Domicilio y un Centro de Día municipal para personas con discapacidad intelectual en situación de dependencia. Ambos recursos encajan de forma directa con el perfil profesional del título, en especial con módulos como Apoyo domiciliario o Atención y apoyo psicosocial.</w:t>
+      </w:r>
+    </w:p>
+    <w:p>
+      <w:pPr>
+        <w:spacing w:after="240" w:line="240"/>
+      </w:pPr>
+      <w:r>
+        <w:rPr>
+          <w:rFonts w:ascii="Arial" w:cs="Arial" w:eastAsia="Arial" w:hAnsi="Arial"/>
+          <w:b/>
+          <w:bCs/>
+          <w:sz w:val="22"/>
+          <w:szCs w:val="22"/>
+        </w:rPr>
+        <w:t xml:space="preserve">Entidades del tercer sector presentes en el municipio: </w:t>
+      </w:r>
+      <w:r>
+        <w:rPr>
+          <w:rFonts w:ascii="Arial" w:cs="Arial" w:eastAsia="Arial" w:hAnsi="Arial"/>
+          <w:sz w:val="22"/>
+          <w:szCs w:val="22"/>
+        </w:rPr>
+        <w:t xml:space="preserve">Según la ficha oficial del proyecto municipal «Atención Integral a Personas Mayores en Situación de Vulnerabilidad» (Concejalía de Política Social del Ayuntamiento de Abarán, financiado por fondos del Plan de Recuperación, Transformación y Resiliencia), el municipio cuenta con Cáritas, Cruz Roja, la Asociación de Disminuidos Físicos de Abarán (ADFA), la Asociación Hogar del Pensionista y la Asociación de Amas de Casa como entidades de iniciativa social activas en la atención a colectivos vulnerables. De entre ellas, ADFA —centrada en discapacidad física— resulta la de mayor afinidad directa con las competencias del Técnico en Integración Social, y consta además como centro de prácticas real de otras titulaciones universitarias del ámbito sociosanitario, lo que confirma su disposición habitual a acoger alumnado en formación.</w:t>
+      </w:r>
+    </w:p>
+    <w:p>
+      <w:pPr>
+        <w:spacing w:after="240" w:line="240"/>
+      </w:pPr>
+      <w:r>
+        <w:rPr>
+          <w:rFonts w:ascii="Arial" w:cs="Arial" w:eastAsia="Arial" w:hAnsi="Arial"/>
+          <w:sz w:val="22"/>
+          <w:szCs w:val="22"/>
+        </w:rPr>
+        <w:t xml:space="preserve">No obstante, </w:t>
+      </w:r>
+      <w:r>
+        <w:rPr>
+          <w:rFonts w:ascii="Arial" w:cs="Arial" w:eastAsia="Arial" w:hAnsi="Arial"/>
+          <w:b/>
+          <w:bCs/>
+          <w:color w:val="C00000"/>
+          <w:sz w:val="22"/>
+          <w:szCs w:val="22"/>
+        </w:rPr>
+        <w:t xml:space="preserve">no se ha podido confirmar que el IES Villa de Abarán mantenga en la actualidad un convenio o colaboración directa con ninguna de estas entidades para la realización de FCT o proyectos de aprendizaje-servicio del ciclo de Integración Social; se trata de recursos reales del territorio, no de colaboradores confirmados del centro</w:t>
+      </w:r>
+      <w:r>
+        <w:rPr>
+          <w:rFonts w:ascii="Arial" w:cs="Arial" w:eastAsia="Arial" w:hAnsi="Arial"/>
+          <w:sz w:val="22"/>
+          <w:szCs w:val="22"/>
+        </w:rPr>
+        <w:t xml:space="preserve">.</w:t>
+      </w:r>
+    </w:p>
+    <w:p>
+      <w:pPr>
+        <w:spacing w:after="240" w:line="240"/>
+      </w:pPr>
+      <w:r>
+        <w:rPr>
+          <w:rFonts w:ascii="Arial" w:cs="Arial" w:eastAsia="Arial" w:hAnsi="Arial"/>
+          <w:sz w:val="22"/>
+          <w:szCs w:val="22"/>
+        </w:rPr>
+        <w:t xml:space="preserve">El perfil demográfico del municipio refuerza, en todo caso, la pertinencia de este entorno: Abarán cuenta con 13.504 habitantes (Padrón municipal, octubre de 2021), de los que aproximadamente uno de cada cinco es mayor de 65 años, un perfil demográfico envejecido que justifica la necesidad real de profesionales de la intervención social en el municipio y abre la puerta al diseño de proyectos de aprendizaje-servicio del módulo vinculados a estos colectivos y entidades.</w:t>
       </w:r>
     </w:p>
     <w:p>

</xml_diff>

<commit_message>
Anadir AFEMCE (Cieza) y parrafo de FP dualizada al 2.3
Se incorpora AFEMCE (Asociacion de Familiares y Personas con Enfermedad
Mental de Cieza y Comarca) al listado de entidades del tercer sector,
verificada como entidad real y activa, tras confirmar que el centro
recibe alumnado de Cieza. Se descarta la Fundacion Hospital de Cieza
por falta de datos recientes.

Se anade un parrafo de cierre indicado por la preparadora sobre la
necesidad de elaborar la programacion de forma minuciosa y concienzuda
(se corrigio "contenciosa", que Pepe confirmo como error) dado que, a
traves de la FP dualizada, el alumnado entra en contacto directo con
las personas vulnerables atendidas por estas entidades.

Co-Authored-By: Claude Sonnet 5 <noreply@anthropic.com>
Claude-Session: https://claude.ai/code/session_018x8SAWzLDt9GJuoqda3PdZ
</commit_message>
<xml_diff>
--- a/preparacion-oposicion-2027/materiales/Plantilla_Entrega2_0017_Habilidades_Sociales.docx
+++ b/preparacion-oposicion-2027/materiales/Plantilla_Entrega2_0017_Habilidades_Sociales.docx
@@ -2091,7 +2091,7 @@
           <w:sz w:val="22"/>
           <w:szCs w:val="22"/>
         </w:rPr>
-        <w:t xml:space="preserve">Según la ficha oficial del proyecto municipal «Atención Integral a Personas Mayores en Situación de Vulnerabilidad» (Concejalía de Política Social del Ayuntamiento de Abarán, financiado por fondos del Plan de Recuperación, Transformación y Resiliencia), el municipio cuenta con Cáritas, Cruz Roja y la Asociación de Disminuidos Físicos de Abarán (ADFA) como entidades de iniciativa social activas en la atención a colectivos vulnerables. De entre ellas, ADFA —centrada en discapacidad física— resulta la de mayor afinidad directa con las competencias del Técnico en Integración Social, y consta además como centro de prácticas real de otras titulaciones universitarias del ámbito sociosanitario, lo que confirma su disposición habitual a acoger alumnado en formación.</w:t>
+        <w:t xml:space="preserve">Según la ficha oficial del proyecto municipal «Atención Integral a Personas Mayores en Situación de Vulnerabilidad» (Concejalía de Política Social del Ayuntamiento de Abarán, financiado por fondos del Plan de Recuperación, Transformación y Resiliencia), el municipio cuenta con Cáritas, Cruz Roja y la Asociación de Disminuidos Físicos de Abarán (ADFA) como entidades de iniciativa social activas en la atención a colectivos vulnerables. A estas se suma, ya en la vecina localidad de Cieza —de donde procede parte del alumnado de los ciclos de Grado Superior del centro—, AFEMCE (Asociación de Familiares y Personas con Enfermedad Mental de Cieza y Comarca), entidad federada en Salud Mental Región de Murcia y activa desde 1998 en la defensa de los derechos de las personas con problemas de salud mental y sus familias. De entre ellas, ADFA y AFEMCE —centradas respectivamente en discapacidad física y en salud mental— resultan las de mayor afinidad directa con las competencias del Técnico en Integración Social; ADFA consta además como centro de prácticas real de otras titulaciones universitarias del ámbito sociosanitario, lo que confirma su disposición habitual a acoger alumnado en formación.</w:t>
       </w:r>
     </w:p>
     <w:p>
@@ -2137,6 +2137,19 @@
           <w:szCs w:val="22"/>
         </w:rPr>
         <w:t xml:space="preserve">El perfil demográfico del municipio refuerza, en todo caso, la pertinencia de este entorno: Abarán cuenta con 13.504 habitantes (Padrón municipal, octubre de 2021), de los que aproximadamente uno de cada cinco es mayor de 65 años, un perfil demográfico envejecido que justifica la necesidad real de profesionales de la intervención social en el municipio y abre la puerta al diseño de proyectos de aprendizaje-servicio del módulo vinculados a estos colectivos y entidades.</w:t>
+      </w:r>
+    </w:p>
+    <w:p>
+      <w:pPr>
+        <w:spacing w:after="240" w:line="240"/>
+      </w:pPr>
+      <w:r>
+        <w:rPr>
+          <w:rFonts w:ascii="Arial" w:cs="Arial" w:eastAsia="Arial" w:hAnsi="Arial"/>
+          <w:sz w:val="22"/>
+          <w:szCs w:val="22"/>
+        </w:rPr>
+        <w:t xml:space="preserve">En este sentido, y dado que la colaboración con estas entidades a través de la Formación Profesional dualizada implica que el alumnado entre en contacto directo con las personas vulnerables atendidas por ellas, esta programación didáctica debe elaborarse de forma minuciosa y concienzuda, garantizando que la atención que dichas entidades prestan a sus propios usuarios no se vea comprometida por la incorporación del alumnado en prácticas.</w:t>
       </w:r>
     </w:p>
     <w:p>

</xml_diff>

<commit_message>
Cerrar definitivamente el punto 3: tabla en 3.2 y UC del modulo 0017 en 3.3
Convierte las 6 competencias del 3.2 en una tabla de dos columnas
(Letra / Competencia), segun pidio Pepe.

Investiga y confirma para el 3.3 que el modulo 0017. Habilidades
sociales NO tiene ninguna unidad de competencia asociada: el Anexo V B)
del RD 1074/2012 (no modificado por el RD 289/2023) solo recoge
correspondencia UC para los modulos 0337 a 0344. Se deja explicito en
el documento que es un modulo transversal, citando el Anexo V B) y el
art. 16 del RD 1074/2012.

Con esto el punto 3 queda cerrado tras resolver las dos preguntas que
Pepe senalo que faltaban por consultarle.

Co-Authored-By: Claude Sonnet 5 <noreply@anthropic.com>
Claude-Session: https://claude.ai/code/session_018x8SAWzLDt9GJuoqda3PdZ
</commit_message>
<xml_diff>
--- a/preparacion-oposicion-2027/materiales/Plantilla_Entrega2_0017_Habilidades_Sociales.docx
+++ b/preparacion-oposicion-2027/materiales/Plantilla_Entrega2_0017_Habilidades_Sociales.docx
@@ -2255,148 +2255,421 @@
         <w:t xml:space="preserve">De estas veintitrés, el propio Real Decreto 1074/2012 —en la redacción del módulo profesional 0017. Habilidades sociales dada por el Real Decreto 289/2023, dentro de sus orientaciones pedagógicas— indica expresamente que este módulo contribuye a alcanzar las competencias profesionales y para la empleabilidad m), o), q), r), s) y u) del título, que se relacionan a continuación:</w:t>
       </w:r>
     </w:p>
-    <w:p>
-      <w:pPr>
-        <w:ind w:left="284"/>
-        <w:spacing w:after="240" w:line="240"/>
-      </w:pPr>
-      <w:r>
-        <w:rPr>
-          <w:rFonts w:ascii="Arial" w:cs="Arial" w:eastAsia="Arial" w:hAnsi="Arial"/>
-          <w:b/>
-          <w:bCs/>
-          <w:sz w:val="22"/>
-          <w:szCs w:val="22"/>
-        </w:rPr>
-        <w:t xml:space="preserve">m) </w:t>
-      </w:r>
-      <w:r>
-        <w:rPr>
-          <w:rFonts w:ascii="Arial" w:cs="Arial" w:eastAsia="Arial" w:hAnsi="Arial"/>
-          <w:sz w:val="22"/>
-          <w:szCs w:val="22"/>
-        </w:rPr>
-        <w:t xml:space="preserve">Realizar tareas de mediación entre personas y grupos, aplicando técnicas participativas y de gestión de conflictos de forma eficiente.</w:t>
-      </w:r>
-    </w:p>
-    <w:p>
-      <w:pPr>
-        <w:ind w:left="284"/>
-        <w:spacing w:after="240" w:line="240"/>
-      </w:pPr>
-      <w:r>
-        <w:rPr>
-          <w:rFonts w:ascii="Arial" w:cs="Arial" w:eastAsia="Arial" w:hAnsi="Arial"/>
-          <w:b/>
-          <w:bCs/>
-          <w:sz w:val="22"/>
-          <w:szCs w:val="22"/>
-        </w:rPr>
-        <w:t xml:space="preserve">o) </w:t>
-      </w:r>
-      <w:r>
-        <w:rPr>
-          <w:rFonts w:ascii="Arial" w:cs="Arial" w:eastAsia="Arial" w:hAnsi="Arial"/>
-          <w:sz w:val="22"/>
-          <w:szCs w:val="22"/>
-        </w:rPr>
-        <w:t xml:space="preserve">Mantener relaciones fluidas con las personas usuarias y sus familias, miembros del grupo de trabajo y otros profesionales, mostrando habilidades sociales y aportando soluciones a los conflictos que surjan.</w:t>
-      </w:r>
-    </w:p>
-    <w:p>
-      <w:pPr>
-        <w:ind w:left="284"/>
-        <w:spacing w:after="240" w:line="240"/>
-      </w:pPr>
-      <w:r>
-        <w:rPr>
-          <w:rFonts w:ascii="Arial" w:cs="Arial" w:eastAsia="Arial" w:hAnsi="Arial"/>
-          <w:b/>
-          <w:bCs/>
-          <w:sz w:val="22"/>
-          <w:szCs w:val="22"/>
-        </w:rPr>
-        <w:t xml:space="preserve">q) </w:t>
-      </w:r>
-      <w:r>
-        <w:rPr>
-          <w:rFonts w:ascii="Arial" w:cs="Arial" w:eastAsia="Arial" w:hAnsi="Arial"/>
-          <w:sz w:val="22"/>
-          <w:szCs w:val="22"/>
-        </w:rPr>
-        <w:t xml:space="preserve">Resolver situaciones, problemas o contingencias con iniciativa y autonomía en el ámbito de su competencia, con creatividad, innovación y espíritu de mejora en el trabajo personal y en el de los miembros del equipo.</w:t>
-      </w:r>
-    </w:p>
-    <w:p>
-      <w:pPr>
-        <w:ind w:left="284"/>
-        <w:spacing w:after="240" w:line="240"/>
-      </w:pPr>
-      <w:r>
-        <w:rPr>
-          <w:rFonts w:ascii="Arial" w:cs="Arial" w:eastAsia="Arial" w:hAnsi="Arial"/>
-          <w:b/>
-          <w:bCs/>
-          <w:sz w:val="22"/>
-          <w:szCs w:val="22"/>
-        </w:rPr>
-        <w:t xml:space="preserve">r) </w:t>
-      </w:r>
-      <w:r>
-        <w:rPr>
-          <w:rFonts w:ascii="Arial" w:cs="Arial" w:eastAsia="Arial" w:hAnsi="Arial"/>
-          <w:sz w:val="22"/>
-          <w:szCs w:val="22"/>
-        </w:rPr>
-        <w:t xml:space="preserve">Organizar y coordinar equipos de trabajo con responsabilidad, supervisando el desarrollo del mismo, manteniendo relaciones fluidas y asumiendo el liderazgo, así como aportando soluciones a los conflictos grupales que se presenten.</w:t>
-      </w:r>
-    </w:p>
-    <w:p>
-      <w:pPr>
-        <w:ind w:left="284"/>
-        <w:spacing w:after="240" w:line="240"/>
-      </w:pPr>
-      <w:r>
-        <w:rPr>
-          <w:rFonts w:ascii="Arial" w:cs="Arial" w:eastAsia="Arial" w:hAnsi="Arial"/>
-          <w:b/>
-          <w:bCs/>
-          <w:sz w:val="22"/>
-          <w:szCs w:val="22"/>
-        </w:rPr>
-        <w:t xml:space="preserve">s) </w:t>
-      </w:r>
-      <w:r>
-        <w:rPr>
-          <w:rFonts w:ascii="Arial" w:cs="Arial" w:eastAsia="Arial" w:hAnsi="Arial"/>
-          <w:sz w:val="22"/>
-          <w:szCs w:val="22"/>
-        </w:rPr>
-        <w:t xml:space="preserve">Comunicarse con sus iguales, superiores, clientes y personas bajo su responsabilidad, utilizando vías eficaces de comunicación, transmitiendo la información o conocimientos adecuados y respetando la autonomía y competencia de las personas que intervienen en el ámbito de su trabajo.</w:t>
-      </w:r>
-    </w:p>
-    <w:p>
-      <w:pPr>
-        <w:ind w:left="284"/>
-        <w:spacing w:after="240" w:line="240"/>
-      </w:pPr>
-      <w:r>
-        <w:rPr>
-          <w:rFonts w:ascii="Arial" w:cs="Arial" w:eastAsia="Arial" w:hAnsi="Arial"/>
-          <w:b/>
-          <w:bCs/>
-          <w:sz w:val="22"/>
-          <w:szCs w:val="22"/>
-        </w:rPr>
-        <w:t xml:space="preserve">u) </w:t>
-      </w:r>
-      <w:r>
-        <w:rPr>
-          <w:rFonts w:ascii="Arial" w:cs="Arial" w:eastAsia="Arial" w:hAnsi="Arial"/>
-          <w:sz w:val="22"/>
-          <w:szCs w:val="22"/>
-        </w:rPr>
-        <w:t xml:space="preserve">Supervisar y aplicar procedimientos de gestión de calidad, de accesibilidad universal y de «diseño para todos», en las actividades profesionales incluidas en los procesos de producción o prestación de servicios.</w:t>
+    <w:tbl>
+      <w:tblPr>
+        <w:tblW w:type="dxa" w:w="9598"/>
+        <w:tblBorders>
+          <w:top w:val="single" w:color="auto" w:sz="4"/>
+          <w:left w:val="single" w:color="auto" w:sz="4"/>
+          <w:bottom w:val="single" w:color="auto" w:sz="4"/>
+          <w:right w:val="single" w:color="auto" w:sz="4"/>
+          <w:insideH w:val="single" w:color="auto" w:sz="4"/>
+          <w:insideV w:val="single" w:color="auto" w:sz="4"/>
+        </w:tblBorders>
+      </w:tblPr>
+      <w:tblGrid>
+        <w:gridCol w:w="700"/>
+        <w:gridCol w:w="8898"/>
+      </w:tblGrid>
+      <w:tr>
+        <w:tc>
+          <w:tcPr>
+            <w:tcW w:type="dxa" w:w="700"/>
+            <w:shd w:fill="DCE6F1" w:color="auto" w:val="clear"/>
+            <w:tcMar>
+              <w:top w:type="dxa" w:w="80"/>
+              <w:left w:type="dxa" w:w="100"/>
+              <w:bottom w:type="dxa" w:w="80"/>
+              <w:right w:type="dxa" w:w="100"/>
+            </w:tcMar>
+            <w:vAlign w:val="center"/>
+          </w:tcPr>
+          <w:p>
+            <w:pPr>
+              <w:spacing w:line="240"/>
+            </w:pPr>
+            <w:r>
+              <w:rPr>
+                <w:rFonts w:ascii="Arial" w:cs="Arial" w:eastAsia="Arial" w:hAnsi="Arial"/>
+                <w:b/>
+                <w:bCs/>
+                <w:sz w:val="20"/>
+                <w:szCs w:val="20"/>
+              </w:rPr>
+              <w:t xml:space="preserve">Letra</w:t>
+            </w:r>
+          </w:p>
+        </w:tc>
+        <w:tc>
+          <w:tcPr>
+            <w:tcW w:type="dxa" w:w="8898"/>
+            <w:tcMar>
+              <w:top w:type="dxa" w:w="80"/>
+              <w:left w:type="dxa" w:w="100"/>
+              <w:bottom w:type="dxa" w:w="80"/>
+              <w:right w:type="dxa" w:w="100"/>
+            </w:tcMar>
+            <w:vAlign w:val="center"/>
+          </w:tcPr>
+          <w:p>
+            <w:pPr>
+              <w:spacing w:line="240"/>
+            </w:pPr>
+            <w:r>
+              <w:rPr>
+                <w:rFonts w:ascii="Arial" w:cs="Arial" w:eastAsia="Arial" w:hAnsi="Arial"/>
+                <w:b/>
+                <w:bCs/>
+                <w:sz w:val="20"/>
+                <w:szCs w:val="20"/>
+              </w:rPr>
+              <w:t xml:space="preserve">Competencia profesional y para la empleabilidad</w:t>
+            </w:r>
+          </w:p>
+        </w:tc>
+      </w:tr>
+      <w:tr>
+        <w:tc>
+          <w:tcPr>
+            <w:tcW w:type="dxa" w:w="700"/>
+            <w:shd w:fill="DCE6F1" w:color="auto" w:val="clear"/>
+            <w:tcMar>
+              <w:top w:type="dxa" w:w="80"/>
+              <w:left w:type="dxa" w:w="100"/>
+              <w:bottom w:type="dxa" w:w="80"/>
+              <w:right w:type="dxa" w:w="100"/>
+            </w:tcMar>
+            <w:vAlign w:val="center"/>
+          </w:tcPr>
+          <w:p>
+            <w:pPr>
+              <w:spacing w:line="240"/>
+            </w:pPr>
+            <w:r>
+              <w:rPr>
+                <w:rFonts w:ascii="Arial" w:cs="Arial" w:eastAsia="Arial" w:hAnsi="Arial"/>
+                <w:b/>
+                <w:bCs/>
+                <w:sz w:val="20"/>
+                <w:szCs w:val="20"/>
+              </w:rPr>
+              <w:t xml:space="preserve">m)</w:t>
+            </w:r>
+          </w:p>
+        </w:tc>
+        <w:tc>
+          <w:tcPr>
+            <w:tcW w:type="dxa" w:w="8898"/>
+            <w:tcMar>
+              <w:top w:type="dxa" w:w="80"/>
+              <w:left w:type="dxa" w:w="100"/>
+              <w:bottom w:type="dxa" w:w="80"/>
+              <w:right w:type="dxa" w:w="100"/>
+            </w:tcMar>
+            <w:vAlign w:val="center"/>
+          </w:tcPr>
+          <w:p>
+            <w:pPr>
+              <w:spacing w:line="240"/>
+            </w:pPr>
+            <w:r>
+              <w:rPr>
+                <w:rFonts w:ascii="Arial" w:cs="Arial" w:eastAsia="Arial" w:hAnsi="Arial"/>
+                <w:sz w:val="20"/>
+                <w:szCs w:val="20"/>
+              </w:rPr>
+              <w:t xml:space="preserve">Realizar tareas de mediación entre personas y grupos, aplicando técnicas participativas y de gestión de conflictos de forma eficiente.</w:t>
+            </w:r>
+          </w:p>
+        </w:tc>
+      </w:tr>
+      <w:tr>
+        <w:tc>
+          <w:tcPr>
+            <w:tcW w:type="dxa" w:w="700"/>
+            <w:shd w:fill="DCE6F1" w:color="auto" w:val="clear"/>
+            <w:tcMar>
+              <w:top w:type="dxa" w:w="80"/>
+              <w:left w:type="dxa" w:w="100"/>
+              <w:bottom w:type="dxa" w:w="80"/>
+              <w:right w:type="dxa" w:w="100"/>
+            </w:tcMar>
+            <w:vAlign w:val="center"/>
+          </w:tcPr>
+          <w:p>
+            <w:pPr>
+              <w:spacing w:line="240"/>
+            </w:pPr>
+            <w:r>
+              <w:rPr>
+                <w:rFonts w:ascii="Arial" w:cs="Arial" w:eastAsia="Arial" w:hAnsi="Arial"/>
+                <w:b/>
+                <w:bCs/>
+                <w:sz w:val="20"/>
+                <w:szCs w:val="20"/>
+              </w:rPr>
+              <w:t xml:space="preserve">o)</w:t>
+            </w:r>
+          </w:p>
+        </w:tc>
+        <w:tc>
+          <w:tcPr>
+            <w:tcW w:type="dxa" w:w="8898"/>
+            <w:tcMar>
+              <w:top w:type="dxa" w:w="80"/>
+              <w:left w:type="dxa" w:w="100"/>
+              <w:bottom w:type="dxa" w:w="80"/>
+              <w:right w:type="dxa" w:w="100"/>
+            </w:tcMar>
+            <w:vAlign w:val="center"/>
+          </w:tcPr>
+          <w:p>
+            <w:pPr>
+              <w:spacing w:line="240"/>
+            </w:pPr>
+            <w:r>
+              <w:rPr>
+                <w:rFonts w:ascii="Arial" w:cs="Arial" w:eastAsia="Arial" w:hAnsi="Arial"/>
+                <w:sz w:val="20"/>
+                <w:szCs w:val="20"/>
+              </w:rPr>
+              <w:t xml:space="preserve">Mantener relaciones fluidas con las personas usuarias y sus familias, miembros del grupo de trabajo y otros profesionales, mostrando habilidades sociales y aportando soluciones a los conflictos que surjan.</w:t>
+            </w:r>
+          </w:p>
+        </w:tc>
+      </w:tr>
+      <w:tr>
+        <w:tc>
+          <w:tcPr>
+            <w:tcW w:type="dxa" w:w="700"/>
+            <w:shd w:fill="DCE6F1" w:color="auto" w:val="clear"/>
+            <w:tcMar>
+              <w:top w:type="dxa" w:w="80"/>
+              <w:left w:type="dxa" w:w="100"/>
+              <w:bottom w:type="dxa" w:w="80"/>
+              <w:right w:type="dxa" w:w="100"/>
+            </w:tcMar>
+            <w:vAlign w:val="center"/>
+          </w:tcPr>
+          <w:p>
+            <w:pPr>
+              <w:spacing w:line="240"/>
+            </w:pPr>
+            <w:r>
+              <w:rPr>
+                <w:rFonts w:ascii="Arial" w:cs="Arial" w:eastAsia="Arial" w:hAnsi="Arial"/>
+                <w:b/>
+                <w:bCs/>
+                <w:sz w:val="20"/>
+                <w:szCs w:val="20"/>
+              </w:rPr>
+              <w:t xml:space="preserve">q)</w:t>
+            </w:r>
+          </w:p>
+        </w:tc>
+        <w:tc>
+          <w:tcPr>
+            <w:tcW w:type="dxa" w:w="8898"/>
+            <w:tcMar>
+              <w:top w:type="dxa" w:w="80"/>
+              <w:left w:type="dxa" w:w="100"/>
+              <w:bottom w:type="dxa" w:w="80"/>
+              <w:right w:type="dxa" w:w="100"/>
+            </w:tcMar>
+            <w:vAlign w:val="center"/>
+          </w:tcPr>
+          <w:p>
+            <w:pPr>
+              <w:spacing w:line="240"/>
+            </w:pPr>
+            <w:r>
+              <w:rPr>
+                <w:rFonts w:ascii="Arial" w:cs="Arial" w:eastAsia="Arial" w:hAnsi="Arial"/>
+                <w:sz w:val="20"/>
+                <w:szCs w:val="20"/>
+              </w:rPr>
+              <w:t xml:space="preserve">Resolver situaciones, problemas o contingencias con iniciativa y autonomía en el ámbito de su competencia, con creatividad, innovación y espíritu de mejora en el trabajo personal y en el de los miembros del equipo.</w:t>
+            </w:r>
+          </w:p>
+        </w:tc>
+      </w:tr>
+      <w:tr>
+        <w:tc>
+          <w:tcPr>
+            <w:tcW w:type="dxa" w:w="700"/>
+            <w:shd w:fill="DCE6F1" w:color="auto" w:val="clear"/>
+            <w:tcMar>
+              <w:top w:type="dxa" w:w="80"/>
+              <w:left w:type="dxa" w:w="100"/>
+              <w:bottom w:type="dxa" w:w="80"/>
+              <w:right w:type="dxa" w:w="100"/>
+            </w:tcMar>
+            <w:vAlign w:val="center"/>
+          </w:tcPr>
+          <w:p>
+            <w:pPr>
+              <w:spacing w:line="240"/>
+            </w:pPr>
+            <w:r>
+              <w:rPr>
+                <w:rFonts w:ascii="Arial" w:cs="Arial" w:eastAsia="Arial" w:hAnsi="Arial"/>
+                <w:b/>
+                <w:bCs/>
+                <w:sz w:val="20"/>
+                <w:szCs w:val="20"/>
+              </w:rPr>
+              <w:t xml:space="preserve">r)</w:t>
+            </w:r>
+          </w:p>
+        </w:tc>
+        <w:tc>
+          <w:tcPr>
+            <w:tcW w:type="dxa" w:w="8898"/>
+            <w:tcMar>
+              <w:top w:type="dxa" w:w="80"/>
+              <w:left w:type="dxa" w:w="100"/>
+              <w:bottom w:type="dxa" w:w="80"/>
+              <w:right w:type="dxa" w:w="100"/>
+            </w:tcMar>
+            <w:vAlign w:val="center"/>
+          </w:tcPr>
+          <w:p>
+            <w:pPr>
+              <w:spacing w:line="240"/>
+            </w:pPr>
+            <w:r>
+              <w:rPr>
+                <w:rFonts w:ascii="Arial" w:cs="Arial" w:eastAsia="Arial" w:hAnsi="Arial"/>
+                <w:sz w:val="20"/>
+                <w:szCs w:val="20"/>
+              </w:rPr>
+              <w:t xml:space="preserve">Organizar y coordinar equipos de trabajo con responsabilidad, supervisando el desarrollo del mismo, manteniendo relaciones fluidas y asumiendo el liderazgo, así como aportando soluciones a los conflictos grupales que se presenten.</w:t>
+            </w:r>
+          </w:p>
+        </w:tc>
+      </w:tr>
+      <w:tr>
+        <w:tc>
+          <w:tcPr>
+            <w:tcW w:type="dxa" w:w="700"/>
+            <w:shd w:fill="DCE6F1" w:color="auto" w:val="clear"/>
+            <w:tcMar>
+              <w:top w:type="dxa" w:w="80"/>
+              <w:left w:type="dxa" w:w="100"/>
+              <w:bottom w:type="dxa" w:w="80"/>
+              <w:right w:type="dxa" w:w="100"/>
+            </w:tcMar>
+            <w:vAlign w:val="center"/>
+          </w:tcPr>
+          <w:p>
+            <w:pPr>
+              <w:spacing w:line="240"/>
+            </w:pPr>
+            <w:r>
+              <w:rPr>
+                <w:rFonts w:ascii="Arial" w:cs="Arial" w:eastAsia="Arial" w:hAnsi="Arial"/>
+                <w:b/>
+                <w:bCs/>
+                <w:sz w:val="20"/>
+                <w:szCs w:val="20"/>
+              </w:rPr>
+              <w:t xml:space="preserve">s)</w:t>
+            </w:r>
+          </w:p>
+        </w:tc>
+        <w:tc>
+          <w:tcPr>
+            <w:tcW w:type="dxa" w:w="8898"/>
+            <w:tcMar>
+              <w:top w:type="dxa" w:w="80"/>
+              <w:left w:type="dxa" w:w="100"/>
+              <w:bottom w:type="dxa" w:w="80"/>
+              <w:right w:type="dxa" w:w="100"/>
+            </w:tcMar>
+            <w:vAlign w:val="center"/>
+          </w:tcPr>
+          <w:p>
+            <w:pPr>
+              <w:spacing w:line="240"/>
+            </w:pPr>
+            <w:r>
+              <w:rPr>
+                <w:rFonts w:ascii="Arial" w:cs="Arial" w:eastAsia="Arial" w:hAnsi="Arial"/>
+                <w:sz w:val="20"/>
+                <w:szCs w:val="20"/>
+              </w:rPr>
+              <w:t xml:space="preserve">Comunicarse con sus iguales, superiores, clientes y personas bajo su responsabilidad, utilizando vías eficaces de comunicación, transmitiendo la información o conocimientos adecuados y respetando la autonomía y competencia de las personas que intervienen en el ámbito de su trabajo.</w:t>
+            </w:r>
+          </w:p>
+        </w:tc>
+      </w:tr>
+      <w:tr>
+        <w:tc>
+          <w:tcPr>
+            <w:tcW w:type="dxa" w:w="700"/>
+            <w:shd w:fill="DCE6F1" w:color="auto" w:val="clear"/>
+            <w:tcMar>
+              <w:top w:type="dxa" w:w="80"/>
+              <w:left w:type="dxa" w:w="100"/>
+              <w:bottom w:type="dxa" w:w="80"/>
+              <w:right w:type="dxa" w:w="100"/>
+            </w:tcMar>
+            <w:vAlign w:val="center"/>
+          </w:tcPr>
+          <w:p>
+            <w:pPr>
+              <w:spacing w:line="240"/>
+            </w:pPr>
+            <w:r>
+              <w:rPr>
+                <w:rFonts w:ascii="Arial" w:cs="Arial" w:eastAsia="Arial" w:hAnsi="Arial"/>
+                <w:b/>
+                <w:bCs/>
+                <w:sz w:val="20"/>
+                <w:szCs w:val="20"/>
+              </w:rPr>
+              <w:t xml:space="preserve">u)</w:t>
+            </w:r>
+          </w:p>
+        </w:tc>
+        <w:tc>
+          <w:tcPr>
+            <w:tcW w:type="dxa" w:w="8898"/>
+            <w:tcMar>
+              <w:top w:type="dxa" w:w="80"/>
+              <w:left w:type="dxa" w:w="100"/>
+              <w:bottom w:type="dxa" w:w="80"/>
+              <w:right w:type="dxa" w:w="100"/>
+            </w:tcMar>
+            <w:vAlign w:val="center"/>
+          </w:tcPr>
+          <w:p>
+            <w:pPr>
+              <w:spacing w:line="240"/>
+            </w:pPr>
+            <w:r>
+              <w:rPr>
+                <w:rFonts w:ascii="Arial" w:cs="Arial" w:eastAsia="Arial" w:hAnsi="Arial"/>
+                <w:sz w:val="20"/>
+                <w:szCs w:val="20"/>
+              </w:rPr>
+              <w:t xml:space="preserve">Supervisar y aplicar procedimientos de gestión de calidad, de accesibilidad universal y de «diseño para todos», en las actividades profesionales incluidas en los procesos de producción o prestación de servicios.</w:t>
+            </w:r>
+          </w:p>
+        </w:tc>
+      </w:tr>
+    </w:tbl>
+    <w:p>
+      <w:pPr>
+        <w:spacing w:after="240" w:line="240"/>
+      </w:pPr>
+      <w:r>
+        <w:rPr>
+          <w:rFonts w:ascii="Arial" w:cs="Arial" w:eastAsia="Arial" w:hAnsi="Arial"/>
+          <w:sz w:val="22"/>
+          <w:szCs w:val="22"/>
+        </w:rPr>
+        <w:t xml:space="preserve"/>
       </w:r>
     </w:p>
     <w:p>
@@ -2910,6 +3183,38 @@
           <w:szCs w:val="22"/>
         </w:rPr>
         <w:t xml:space="preserve">UC1024_3: Establecer estrategias de comunicación y difusión de los diferentes proyectos y actuaciones comunitarias.</w:t>
+      </w:r>
+    </w:p>
+    <w:p>
+      <w:pPr>
+        <w:spacing w:after="240" w:line="240"/>
+      </w:pPr>
+      <w:r>
+        <w:rPr>
+          <w:rFonts w:ascii="Arial" w:cs="Arial" w:eastAsia="Arial" w:hAnsi="Arial"/>
+          <w:sz w:val="22"/>
+          <w:szCs w:val="22"/>
+        </w:rPr>
+        <w:t xml:space="preserve">Respecto al módulo profesional 0017. Habilidades sociales en particular, </w:t>
+      </w:r>
+      <w:r>
+        <w:rPr>
+          <w:rFonts w:ascii="Arial" w:cs="Arial" w:eastAsia="Arial" w:hAnsi="Arial"/>
+          <w:b/>
+          <w:bCs/>
+          <w:color w:val="C00000"/>
+          <w:sz w:val="22"/>
+          <w:szCs w:val="22"/>
+        </w:rPr>
+        <w:t xml:space="preserve">la correspondencia de módulos profesionales con unidades de competencia establecida en el Anexo V B) del Real Decreto 1074/2012 —no modificado por el Real Decreto 289/2023— no incluye el módulo 0017 entre los módulos con unidad de competencia acreditable (sí lo están, entre otros, los módulos 0337 a 0344). Se trata, por tanto, de un módulo transversal, no asociado a ninguna unidad de competencia concreta, que complementa de forma global la formación del título sin corresponderse con una cualificación profesional específica</w:t>
+      </w:r>
+      <w:r>
+        <w:rPr>
+          <w:rFonts w:ascii="Arial" w:cs="Arial" w:eastAsia="Arial" w:hAnsi="Arial"/>
+          <w:sz w:val="22"/>
+          <w:szCs w:val="22"/>
+        </w:rPr>
+        <w:t xml:space="preserve">.</w:t>
       </w:r>
     </w:p>
     <w:sectPr>

</xml_diff>

<commit_message>
Anadir introduccion generica al punto 3 (competencias y saber hacer)
Incorpora el parrafo introductorio sobre que son las competencias desde
una perspectiva curricular (saber hacer, proceso de ensenanza-
aprendizaje, diferenciacion entre competencia general y competencias
profesionales/empleabilidad) antes del 3.1, tal y como lo plantea la
guia de la preparadora justo antes de ese apartado.

Co-Authored-By: Claude Sonnet 5 <noreply@anthropic.com>
Claude-Session: https://claude.ai/code/session_018x8SAWzLDt9GJuoqda3PdZ
</commit_message>
<xml_diff>
--- a/preparacion-oposicion-2027/materiales/Plantilla_Entrega2_0017_Habilidades_Sociales.docx
+++ b/preparacion-oposicion-2027/materiales/Plantilla_Entrega2_0017_Habilidades_Sociales.docx
@@ -2166,6 +2166,32 @@
           <w:szCs w:val="28"/>
         </w:rPr>
         <w:t xml:space="preserve">3. PERFIL PROFESIONAL Y CURRICULAR</w:t>
+      </w:r>
+    </w:p>
+    <w:p>
+      <w:pPr>
+        <w:spacing w:after="240" w:line="240"/>
+      </w:pPr>
+      <w:r>
+        <w:rPr>
+          <w:rFonts w:ascii="Arial" w:cs="Arial" w:eastAsia="Arial" w:hAnsi="Arial"/>
+          <w:sz w:val="22"/>
+          <w:szCs w:val="22"/>
+        </w:rPr>
+        <w:t xml:space="preserve">Hablar de competencias es hablar de «saber hacer en...», es decir, de las diferentes capacidades y habilidades que posee una persona, pero que además es capaz de utilizar con éxito en las distintas interacciones con las que el alumnado se encuentra tanto en su ámbito personal como social y laboral. En este sentido, debe tenerse presente que las competencias van más allá de las simples capacidades o habilidades, y suponen la aplicación de estas a un entorno real.</w:t>
+      </w:r>
+    </w:p>
+    <w:p>
+      <w:pPr>
+        <w:spacing w:after="240" w:line="240"/>
+      </w:pPr>
+      <w:r>
+        <w:rPr>
+          <w:rFonts w:ascii="Arial" w:cs="Arial" w:eastAsia="Arial" w:hAnsi="Arial"/>
+          <w:sz w:val="22"/>
+          <w:szCs w:val="22"/>
+        </w:rPr>
+        <w:t xml:space="preserve">Se pueden definir, por tanto, las competencias desde una perspectiva curricular como el conjunto de habilidades cognitivas, procedimentales y actitudinales que el alumnado puede y debe alcanzar a lo largo del proceso de enseñanza-aprendizaje, y que resultan imprescindibles para garantizar su desenvolvimiento personal, social y laboral, así como la adecuación a las necesidades del contexto laboral. Constituyen el principal referente que marca los logros que el profesorado debe desarrollar en el alumnado como consecuencia de los procesos formativos y educativos. En concreto, en la Formación Profesional se diferencia entre la competencia general del título y las competencias profesionales y para la empleabilidad, que se desarrollan en los apartados siguientes.</w:t>
       </w:r>
     </w:p>
     <w:p>

</xml_diff>